<commit_message>
Correction sur la branche Police
</commit_message>
<xml_diff>
--- a/src/production/templates/police/courriers/Appel de prime.docx
+++ b/src/production/templates/police/courriers/Appel de prime.docx
@@ -100,21 +100,34 @@
               <w:t xml:space="preserve">     </w:t>
             </w:r>
             <w:r>
-              <w:t xml:space="preserve"> Abidjan, </w:t>
-            </w:r>
-            <w:r>
-              <w:t>le</w:t>
+              <w:t xml:space="preserve"> </w:t>
             </w:r>
             <w:proofErr w:type="gramStart"/>
             <w:r>
-              <w:t xml:space="preserve"> «</w:t>
-            </w:r>
-            <w:r>
-              <w:t>DATE</w:t>
+              <w:rPr>
+                <w:rFonts w:ascii="Avenir" w:hAnsi="Avenir" w:cstheme="minorHAnsi"/>
+                <w:sz w:val="24"/>
+                <w:szCs w:val="24"/>
+              </w:rPr>
+              <w:t>«CABINET</w:t>
             </w:r>
             <w:proofErr w:type="gramEnd"/>
             <w:r>
-              <w:t>_JOUR</w:t>
+              <w:rPr>
+                <w:rFonts w:ascii="Avenir" w:hAnsi="Avenir" w:cstheme="minorHAnsi"/>
+                <w:sz w:val="24"/>
+                <w:szCs w:val="24"/>
+              </w:rPr>
+              <w:t>_VILLECAB»</w:t>
+            </w:r>
+            <w:r>
+              <w:t xml:space="preserve">, </w:t>
+            </w:r>
+            <w:r>
+              <w:t>le «</w:t>
+            </w:r>
+            <w:r>
+              <w:t>DATE_JOUR</w:t>
             </w:r>
             <w:r>
               <w:t>»</w:t>
@@ -216,6 +229,16 @@
               <w:spacing w:after="160" w:line="259" w:lineRule="auto"/>
             </w:pPr>
           </w:p>
+          <w:p>
+            <w:pPr>
+              <w:spacing w:after="160" w:line="259" w:lineRule="auto"/>
+            </w:pPr>
+          </w:p>
+          <w:p>
+            <w:pPr>
+              <w:spacing w:after="160" w:line="259" w:lineRule="auto"/>
+            </w:pPr>
+          </w:p>
         </w:tc>
         <w:tc>
           <w:tcPr>
@@ -237,283 +260,6 @@
             <w:vAlign w:val="center"/>
             <w:hideMark/>
           </w:tcPr>
-          <w:p>
-            <w:pPr>
-              <w:spacing w:after="160" w:line="259" w:lineRule="auto"/>
-            </w:pPr>
-          </w:p>
-        </w:tc>
-      </w:tr>
-      <w:tr>
-        <w:tc>
-          <w:tcPr>
-            <w:tcW w:w="3402" w:type="dxa"/>
-          </w:tcPr>
-          <w:p>
-            <w:pPr>
-              <w:spacing w:after="160" w:line="259" w:lineRule="auto"/>
-              <w:rPr>
-                <w:b/>
-              </w:rPr>
-            </w:pPr>
-          </w:p>
-        </w:tc>
-        <w:tc>
-          <w:tcPr>
-            <w:tcW w:w="0" w:type="auto"/>
-            <w:vMerge/>
-            <w:vAlign w:val="center"/>
-            <w:hideMark/>
-          </w:tcPr>
-          <w:p>
-            <w:pPr>
-              <w:spacing w:after="160" w:line="259" w:lineRule="auto"/>
-            </w:pPr>
-          </w:p>
-        </w:tc>
-        <w:tc>
-          <w:tcPr>
-            <w:tcW w:w="0" w:type="auto"/>
-            <w:vMerge/>
-            <w:vAlign w:val="center"/>
-            <w:hideMark/>
-          </w:tcPr>
-          <w:p>
-            <w:pPr>
-              <w:spacing w:after="160" w:line="259" w:lineRule="auto"/>
-            </w:pPr>
-          </w:p>
-        </w:tc>
-      </w:tr>
-      <w:tr>
-        <w:tc>
-          <w:tcPr>
-            <w:tcW w:w="3402" w:type="dxa"/>
-          </w:tcPr>
-          <w:p>
-            <w:pPr>
-              <w:spacing w:after="160" w:line="259" w:lineRule="auto"/>
-            </w:pPr>
-          </w:p>
-        </w:tc>
-        <w:tc>
-          <w:tcPr>
-            <w:tcW w:w="0" w:type="auto"/>
-            <w:vMerge/>
-            <w:vAlign w:val="center"/>
-            <w:hideMark/>
-          </w:tcPr>
-          <w:p>
-            <w:pPr>
-              <w:spacing w:after="160" w:line="259" w:lineRule="auto"/>
-            </w:pPr>
-          </w:p>
-        </w:tc>
-        <w:tc>
-          <w:tcPr>
-            <w:tcW w:w="0" w:type="auto"/>
-            <w:vMerge/>
-            <w:vAlign w:val="center"/>
-            <w:hideMark/>
-          </w:tcPr>
-          <w:p>
-            <w:pPr>
-              <w:spacing w:after="160" w:line="259" w:lineRule="auto"/>
-            </w:pPr>
-          </w:p>
-        </w:tc>
-      </w:tr>
-      <w:tr>
-        <w:tc>
-          <w:tcPr>
-            <w:tcW w:w="3402" w:type="dxa"/>
-          </w:tcPr>
-          <w:p>
-            <w:pPr>
-              <w:spacing w:after="160" w:line="259" w:lineRule="auto"/>
-              <w:rPr>
-                <w:b/>
-              </w:rPr>
-            </w:pPr>
-          </w:p>
-        </w:tc>
-        <w:tc>
-          <w:tcPr>
-            <w:tcW w:w="0" w:type="auto"/>
-            <w:vMerge/>
-            <w:vAlign w:val="center"/>
-            <w:hideMark/>
-          </w:tcPr>
-          <w:p>
-            <w:pPr>
-              <w:spacing w:after="160" w:line="259" w:lineRule="auto"/>
-            </w:pPr>
-          </w:p>
-        </w:tc>
-        <w:tc>
-          <w:tcPr>
-            <w:tcW w:w="0" w:type="auto"/>
-            <w:vMerge/>
-            <w:vAlign w:val="center"/>
-            <w:hideMark/>
-          </w:tcPr>
-          <w:p>
-            <w:pPr>
-              <w:spacing w:after="160" w:line="259" w:lineRule="auto"/>
-            </w:pPr>
-          </w:p>
-        </w:tc>
-      </w:tr>
-      <w:tr>
-        <w:tc>
-          <w:tcPr>
-            <w:tcW w:w="3402" w:type="dxa"/>
-          </w:tcPr>
-          <w:p>
-            <w:pPr>
-              <w:spacing w:after="160" w:line="259" w:lineRule="auto"/>
-            </w:pPr>
-          </w:p>
-        </w:tc>
-        <w:tc>
-          <w:tcPr>
-            <w:tcW w:w="0" w:type="auto"/>
-            <w:vMerge/>
-            <w:vAlign w:val="center"/>
-            <w:hideMark/>
-          </w:tcPr>
-          <w:p>
-            <w:pPr>
-              <w:spacing w:after="160" w:line="259" w:lineRule="auto"/>
-            </w:pPr>
-          </w:p>
-        </w:tc>
-        <w:tc>
-          <w:tcPr>
-            <w:tcW w:w="0" w:type="auto"/>
-            <w:vMerge/>
-            <w:vAlign w:val="center"/>
-            <w:hideMark/>
-          </w:tcPr>
-          <w:p>
-            <w:pPr>
-              <w:spacing w:after="160" w:line="259" w:lineRule="auto"/>
-            </w:pPr>
-          </w:p>
-        </w:tc>
-      </w:tr>
-      <w:tr>
-        <w:tc>
-          <w:tcPr>
-            <w:tcW w:w="3402" w:type="dxa"/>
-          </w:tcPr>
-          <w:p>
-            <w:pPr>
-              <w:spacing w:after="160" w:line="259" w:lineRule="auto"/>
-              <w:rPr>
-                <w:b/>
-              </w:rPr>
-            </w:pPr>
-          </w:p>
-        </w:tc>
-        <w:tc>
-          <w:tcPr>
-            <w:tcW w:w="0" w:type="auto"/>
-            <w:vMerge/>
-            <w:vAlign w:val="center"/>
-            <w:hideMark/>
-          </w:tcPr>
-          <w:p>
-            <w:pPr>
-              <w:spacing w:after="160" w:line="259" w:lineRule="auto"/>
-            </w:pPr>
-          </w:p>
-        </w:tc>
-        <w:tc>
-          <w:tcPr>
-            <w:tcW w:w="0" w:type="auto"/>
-            <w:vMerge/>
-            <w:vAlign w:val="center"/>
-            <w:hideMark/>
-          </w:tcPr>
-          <w:p>
-            <w:pPr>
-              <w:spacing w:after="160" w:line="259" w:lineRule="auto"/>
-            </w:pPr>
-          </w:p>
-        </w:tc>
-      </w:tr>
-      <w:tr>
-        <w:tc>
-          <w:tcPr>
-            <w:tcW w:w="3402" w:type="dxa"/>
-          </w:tcPr>
-          <w:p>
-            <w:pPr>
-              <w:spacing w:after="160" w:line="259" w:lineRule="auto"/>
-            </w:pPr>
-          </w:p>
-        </w:tc>
-        <w:tc>
-          <w:tcPr>
-            <w:tcW w:w="0" w:type="auto"/>
-            <w:vMerge/>
-            <w:vAlign w:val="center"/>
-            <w:hideMark/>
-          </w:tcPr>
-          <w:p>
-            <w:pPr>
-              <w:spacing w:after="160" w:line="259" w:lineRule="auto"/>
-            </w:pPr>
-          </w:p>
-        </w:tc>
-        <w:tc>
-          <w:tcPr>
-            <w:tcW w:w="0" w:type="auto"/>
-            <w:vMerge/>
-            <w:vAlign w:val="center"/>
-            <w:hideMark/>
-          </w:tcPr>
-          <w:p>
-            <w:pPr>
-              <w:spacing w:after="160" w:line="259" w:lineRule="auto"/>
-            </w:pPr>
-          </w:p>
-        </w:tc>
-      </w:tr>
-      <w:tr>
-        <w:tc>
-          <w:tcPr>
-            <w:tcW w:w="3402" w:type="dxa"/>
-          </w:tcPr>
-          <w:p>
-            <w:pPr>
-              <w:spacing w:after="160" w:line="259" w:lineRule="auto"/>
-              <w:rPr>
-                <w:b/>
-              </w:rPr>
-            </w:pPr>
-          </w:p>
-        </w:tc>
-        <w:tc>
-          <w:tcPr>
-            <w:tcW w:w="1474" w:type="dxa"/>
-          </w:tcPr>
-          <w:p>
-            <w:pPr>
-              <w:spacing w:after="160" w:line="259" w:lineRule="auto"/>
-            </w:pPr>
-          </w:p>
-        </w:tc>
-        <w:tc>
-          <w:tcPr>
-            <w:tcW w:w="4989" w:type="dxa"/>
-          </w:tcPr>
-          <w:p>
-            <w:pPr>
-              <w:spacing w:after="160" w:line="259" w:lineRule="auto"/>
-            </w:pPr>
-          </w:p>
           <w:p>
             <w:pPr>
               <w:spacing w:after="160" w:line="259" w:lineRule="auto"/>
@@ -982,13 +728,6 @@
           <w:b/>
         </w:rPr>
       </w:pPr>
-    </w:p>
-    <w:p>
-      <w:pPr>
-        <w:rPr>
-          <w:b/>
-        </w:rPr>
-      </w:pPr>
       <w:r>
         <w:rPr>
           <w:b/>
@@ -1002,12 +741,13 @@
           <w:b/>
         </w:rPr>
       </w:pPr>
-      <w:r>
+    </w:p>
+    <w:p>
+      <w:pPr>
         <w:rPr>
           <w:b/>
         </w:rPr>
-        <w:t xml:space="preserve"> </w:t>
-      </w:r>
+      </w:pPr>
     </w:p>
     <w:p/>
     <w:tbl>
@@ -1116,30 +856,13 @@
       <w:pPr>
         <w:rPr>
           <w:b/>
-          <w:i/>
-          <w:u w:val="single"/>
-        </w:rPr>
-      </w:pPr>
-    </w:p>
-    <w:p>
-      <w:pPr>
-        <w:rPr>
-          <w:b/>
-          <w:i/>
-          <w:u w:val="single"/>
-        </w:rPr>
-      </w:pPr>
-    </w:p>
-    <w:p>
-      <w:pPr>
-        <w:rPr>
-          <w:b/>
         </w:rPr>
       </w:pPr>
     </w:p>
     <w:p/>
     <w:sectPr>
       <w:headerReference w:type="default" r:id="rId6"/>
+      <w:footerReference w:type="default" r:id="rId7"/>
       <w:pgSz w:w="11906" w:h="16838"/>
       <w:pgMar w:top="1417" w:right="1417" w:bottom="1417" w:left="1417" w:header="708" w:footer="708" w:gutter="0"/>
       <w:cols w:space="708"/>
@@ -1174,6 +897,197 @@
 </w:endnotes>
 </file>
 
+<file path=word/footer1.xml><?xml version="1.0" encoding="utf-8"?>
+<w:ftr xmlns:wpc="http://schemas.microsoft.com/office/word/2010/wordprocessingCanvas" xmlns:cx="http://schemas.microsoft.com/office/drawing/2014/chartex" xmlns:cx1="http://schemas.microsoft.com/office/drawing/2015/9/8/chartex" xmlns:cx2="http://schemas.microsoft.com/office/drawing/2015/10/21/chartex" xmlns:cx3="http://schemas.microsoft.com/office/drawing/2016/5/9/chartex" xmlns:cx4="http://schemas.microsoft.com/office/drawing/2016/5/10/chartex" xmlns:cx5="http://schemas.microsoft.com/office/drawing/2016/5/11/chartex" xmlns:cx6="http://schemas.microsoft.com/office/drawing/2016/5/12/chartex" xmlns:cx7="http://schemas.microsoft.com/office/drawing/2016/5/13/chartex" xmlns:cx8="http://schemas.microsoft.com/office/drawing/2016/5/14/chartex" xmlns:mc="http://schemas.openxmlformats.org/markup-compatibility/2006" xmlns:aink="http://schemas.microsoft.com/office/drawing/2016/ink" xmlns:am3d="http://schemas.microsoft.com/office/drawing/2017/model3d" xmlns:o="urn:schemas-microsoft-com:office:office" xmlns:oel="http://schemas.microsoft.com/office/2019/extlst" xmlns:r="http://schemas.openxmlformats.org/officeDocument/2006/relationships" xmlns:m="http://schemas.openxmlformats.org/officeDocument/2006/math" xmlns:v="urn:schemas-microsoft-com:vml" xmlns:wp14="http://schemas.microsoft.com/office/word/2010/wordprocessingDrawing" xmlns:wp="http://schemas.openxmlformats.org/drawingml/2006/wordprocessingDrawing" xmlns:w10="urn:schemas-microsoft-com:office:word" xmlns:w="http://schemas.openxmlformats.org/wordprocessingml/2006/main" xmlns:w14="http://schemas.microsoft.com/office/word/2010/wordml" xmlns:w15="http://schemas.microsoft.com/office/word/2012/wordml" xmlns:w16cex="http://schemas.microsoft.com/office/word/2018/wordml/cex" xmlns:w16cid="http://schemas.microsoft.com/office/word/2016/wordml/cid" xmlns:w16="http://schemas.microsoft.com/office/word/2018/wordml" xmlns:w16sdtdh="http://schemas.microsoft.com/office/word/2020/wordml/sdtdatahash" xmlns:w16se="http://schemas.microsoft.com/office/word/2015/wordml/symex" xmlns:wpg="http://schemas.microsoft.com/office/word/2010/wordprocessingGroup" xmlns:wpi="http://schemas.microsoft.com/office/word/2010/wordprocessingInk" xmlns:wne="http://schemas.microsoft.com/office/word/2006/wordml" xmlns:wps="http://schemas.microsoft.com/office/word/2010/wordprocessingShape" mc:Ignorable="w14 w15 w16se w16cid w16 w16cex w16sdtdh wp14">
+  <w:tbl>
+    <w:tblPr>
+      <w:tblStyle w:val="Grilledutableau"/>
+      <w:tblpPr w:leftFromText="142" w:rightFromText="142" w:vertAnchor="text" w:horzAnchor="page" w:tblpX="568" w:tblpY="1"/>
+      <w:tblOverlap w:val="never"/>
+      <w:tblW w:w="10772" w:type="dxa"/>
+      <w:tblBorders>
+        <w:top w:val="none" w:sz="0" w:space="0" w:color="auto"/>
+        <w:left w:val="none" w:sz="0" w:space="0" w:color="auto"/>
+        <w:bottom w:val="none" w:sz="0" w:space="0" w:color="auto"/>
+        <w:right w:val="none" w:sz="0" w:space="0" w:color="auto"/>
+        <w:insideV w:val="none" w:sz="0" w:space="0" w:color="auto"/>
+      </w:tblBorders>
+      <w:tblLook w:val="04A0" w:firstRow="1" w:lastRow="0" w:firstColumn="1" w:lastColumn="0" w:noHBand="0" w:noVBand="1"/>
+    </w:tblPr>
+    <w:tblGrid>
+      <w:gridCol w:w="10772"/>
+    </w:tblGrid>
+    <w:tr>
+      <w:tc>
+        <w:tcPr>
+          <w:tcW w:w="10772" w:type="dxa"/>
+        </w:tcPr>
+        <w:p>
+          <w:pPr>
+            <w:pStyle w:val="Pieddepage"/>
+            <w:jc w:val="right"/>
+            <w:rPr>
+              <w:color w:val="808080" w:themeColor="background1" w:themeShade="80"/>
+              <w:sz w:val="16"/>
+              <w:szCs w:val="16"/>
+            </w:rPr>
+          </w:pPr>
+          <w:r>
+            <w:rPr>
+              <w:color w:val="808080" w:themeColor="background1" w:themeShade="80"/>
+              <w:sz w:val="16"/>
+              <w:szCs w:val="16"/>
+            </w:rPr>
+            <w:t xml:space="preserve">Page </w:t>
+          </w:r>
+          <w:r>
+            <w:rPr>
+              <w:bCs/>
+              <w:color w:val="808080" w:themeColor="background1" w:themeShade="80"/>
+              <w:sz w:val="16"/>
+              <w:szCs w:val="16"/>
+            </w:rPr>
+            <w:fldChar w:fldCharType="begin"/>
+          </w:r>
+          <w:r>
+            <w:rPr>
+              <w:bCs/>
+              <w:color w:val="808080" w:themeColor="background1" w:themeShade="80"/>
+              <w:sz w:val="16"/>
+              <w:szCs w:val="16"/>
+            </w:rPr>
+            <w:instrText>PAGE  \* Arabic  \* MERGEFORMAT</w:instrText>
+          </w:r>
+          <w:r>
+            <w:rPr>
+              <w:bCs/>
+              <w:color w:val="808080" w:themeColor="background1" w:themeShade="80"/>
+              <w:sz w:val="16"/>
+              <w:szCs w:val="16"/>
+            </w:rPr>
+            <w:fldChar w:fldCharType="separate"/>
+          </w:r>
+          <w:r>
+            <w:rPr>
+              <w:bCs/>
+              <w:noProof/>
+              <w:color w:val="808080" w:themeColor="background1" w:themeShade="80"/>
+              <w:sz w:val="16"/>
+              <w:szCs w:val="16"/>
+            </w:rPr>
+            <w:t>1</w:t>
+          </w:r>
+          <w:r>
+            <w:rPr>
+              <w:bCs/>
+              <w:color w:val="808080" w:themeColor="background1" w:themeShade="80"/>
+              <w:sz w:val="16"/>
+              <w:szCs w:val="16"/>
+            </w:rPr>
+            <w:fldChar w:fldCharType="end"/>
+          </w:r>
+          <w:r>
+            <w:rPr>
+              <w:color w:val="808080" w:themeColor="background1" w:themeShade="80"/>
+              <w:sz w:val="16"/>
+              <w:szCs w:val="16"/>
+            </w:rPr>
+            <w:t xml:space="preserve"> / </w:t>
+          </w:r>
+          <w:r>
+            <w:rPr>
+              <w:bCs/>
+              <w:color w:val="808080" w:themeColor="background1" w:themeShade="80"/>
+              <w:sz w:val="16"/>
+              <w:szCs w:val="16"/>
+            </w:rPr>
+            <w:fldChar w:fldCharType="begin"/>
+          </w:r>
+          <w:r>
+            <w:rPr>
+              <w:bCs/>
+              <w:color w:val="808080" w:themeColor="background1" w:themeShade="80"/>
+              <w:sz w:val="16"/>
+              <w:szCs w:val="16"/>
+            </w:rPr>
+            <w:instrText>NUMPAGES  \* Arabic  \* MERGEFORMAT</w:instrText>
+          </w:r>
+          <w:r>
+            <w:rPr>
+              <w:bCs/>
+              <w:color w:val="808080" w:themeColor="background1" w:themeShade="80"/>
+              <w:sz w:val="16"/>
+              <w:szCs w:val="16"/>
+            </w:rPr>
+            <w:fldChar w:fldCharType="separate"/>
+          </w:r>
+          <w:r>
+            <w:rPr>
+              <w:bCs/>
+              <w:noProof/>
+              <w:color w:val="808080" w:themeColor="background1" w:themeShade="80"/>
+              <w:sz w:val="16"/>
+              <w:szCs w:val="16"/>
+            </w:rPr>
+            <w:t>1</w:t>
+          </w:r>
+          <w:r>
+            <w:rPr>
+              <w:bCs/>
+              <w:color w:val="808080" w:themeColor="background1" w:themeShade="80"/>
+              <w:sz w:val="16"/>
+              <w:szCs w:val="16"/>
+            </w:rPr>
+            <w:fldChar w:fldCharType="end"/>
+          </w:r>
+        </w:p>
+      </w:tc>
+    </w:tr>
+    <w:tr>
+      <w:tc>
+        <w:tcPr>
+          <w:tcW w:w="10772" w:type="dxa"/>
+        </w:tcPr>
+        <w:p>
+          <w:pPr>
+            <w:pStyle w:val="Pieddepage"/>
+            <w:jc w:val="center"/>
+            <w:rPr>
+              <w:color w:val="808080" w:themeColor="background1" w:themeShade="80"/>
+              <w:sz w:val="16"/>
+              <w:szCs w:val="16"/>
+            </w:rPr>
+          </w:pPr>
+          <w:proofErr w:type="gramStart"/>
+          <w:r>
+            <w:rPr>
+              <w:color w:val="808080" w:themeColor="background1" w:themeShade="80"/>
+              <w:sz w:val="18"/>
+              <w:szCs w:val="18"/>
+            </w:rPr>
+            <w:t>«CABINET</w:t>
+          </w:r>
+          <w:proofErr w:type="gramEnd"/>
+          <w:r>
+            <w:rPr>
+              <w:color w:val="808080" w:themeColor="background1" w:themeShade="80"/>
+              <w:sz w:val="18"/>
+              <w:szCs w:val="18"/>
+            </w:rPr>
+            <w:t>_MENTIONS»</w:t>
+          </w:r>
+        </w:p>
+      </w:tc>
+    </w:tr>
+  </w:tbl>
+  <w:p>
+    <w:pPr>
+      <w:pStyle w:val="Pieddepage"/>
+    </w:pPr>
+  </w:p>
+</w:ftr>
+</file>
+
 <file path=word/footnotes.xml><?xml version="1.0" encoding="utf-8"?>
 <w:footnotes xmlns:wpc="http://schemas.microsoft.com/office/word/2010/wordprocessingCanvas" xmlns:cx="http://schemas.microsoft.com/office/drawing/2014/chartex" xmlns:cx1="http://schemas.microsoft.com/office/drawing/2015/9/8/chartex" xmlns:cx2="http://schemas.microsoft.com/office/drawing/2015/10/21/chartex" xmlns:cx3="http://schemas.microsoft.com/office/drawing/2016/5/9/chartex" xmlns:cx4="http://schemas.microsoft.com/office/drawing/2016/5/10/chartex" xmlns:cx5="http://schemas.microsoft.com/office/drawing/2016/5/11/chartex" xmlns:cx6="http://schemas.microsoft.com/office/drawing/2016/5/12/chartex" xmlns:cx7="http://schemas.microsoft.com/office/drawing/2016/5/13/chartex" xmlns:cx8="http://schemas.microsoft.com/office/drawing/2016/5/14/chartex" xmlns:mc="http://schemas.openxmlformats.org/markup-compatibility/2006" xmlns:aink="http://schemas.microsoft.com/office/drawing/2016/ink" xmlns:am3d="http://schemas.microsoft.com/office/drawing/2017/model3d" xmlns:o="urn:schemas-microsoft-com:office:office" xmlns:oel="http://schemas.microsoft.com/office/2019/extlst" xmlns:r="http://schemas.openxmlformats.org/officeDocument/2006/relationships" xmlns:m="http://schemas.openxmlformats.org/officeDocument/2006/math" xmlns:v="urn:schemas-microsoft-com:vml" xmlns:wp14="http://schemas.microsoft.com/office/word/2010/wordprocessingDrawing" xmlns:wp="http://schemas.openxmlformats.org/drawingml/2006/wordprocessingDrawing" xmlns:w10="urn:schemas-microsoft-com:office:word" xmlns:w="http://schemas.openxmlformats.org/wordprocessingml/2006/main" xmlns:w14="http://schemas.microsoft.com/office/word/2010/wordml" xmlns:w15="http://schemas.microsoft.com/office/word/2012/wordml" xmlns:w16cex="http://schemas.microsoft.com/office/word/2018/wordml/cex" xmlns:w16cid="http://schemas.microsoft.com/office/word/2016/wordml/cid" xmlns:w16="http://schemas.microsoft.com/office/word/2018/wordml" xmlns:w16sdtdh="http://schemas.microsoft.com/office/word/2020/wordml/sdtdatahash" xmlns:w16se="http://schemas.microsoft.com/office/word/2015/wordml/symex" xmlns:wpg="http://schemas.microsoft.com/office/word/2010/wordprocessingGroup" xmlns:wpi="http://schemas.microsoft.com/office/word/2010/wordprocessingInk" xmlns:wne="http://schemas.microsoft.com/office/word/2006/wordml" xmlns:wps="http://schemas.microsoft.com/office/word/2010/wordprocessingShape" mc:Ignorable="w14 w15 w16se w16cid w16 w16cex w16sdtdh wp14">
   <w:footnote w:type="separator" w:id="-1">
@@ -1203,7 +1117,9 @@
 <w:hdr xmlns:wpc="http://schemas.microsoft.com/office/word/2010/wordprocessingCanvas" xmlns:cx="http://schemas.microsoft.com/office/drawing/2014/chartex" xmlns:cx1="http://schemas.microsoft.com/office/drawing/2015/9/8/chartex" xmlns:cx2="http://schemas.microsoft.com/office/drawing/2015/10/21/chartex" xmlns:cx3="http://schemas.microsoft.com/office/drawing/2016/5/9/chartex" xmlns:cx4="http://schemas.microsoft.com/office/drawing/2016/5/10/chartex" xmlns:cx5="http://schemas.microsoft.com/office/drawing/2016/5/11/chartex" xmlns:cx6="http://schemas.microsoft.com/office/drawing/2016/5/12/chartex" xmlns:cx7="http://schemas.microsoft.com/office/drawing/2016/5/13/chartex" xmlns:cx8="http://schemas.microsoft.com/office/drawing/2016/5/14/chartex" xmlns:mc="http://schemas.openxmlformats.org/markup-compatibility/2006" xmlns:aink="http://schemas.microsoft.com/office/drawing/2016/ink" xmlns:am3d="http://schemas.microsoft.com/office/drawing/2017/model3d" xmlns:o="urn:schemas-microsoft-com:office:office" xmlns:oel="http://schemas.microsoft.com/office/2019/extlst" xmlns:r="http://schemas.openxmlformats.org/officeDocument/2006/relationships" xmlns:m="http://schemas.openxmlformats.org/officeDocument/2006/math" xmlns:v="urn:schemas-microsoft-com:vml" xmlns:wp14="http://schemas.microsoft.com/office/word/2010/wordprocessingDrawing" xmlns:wp="http://schemas.openxmlformats.org/drawingml/2006/wordprocessingDrawing" xmlns:w10="urn:schemas-microsoft-com:office:word" xmlns:w="http://schemas.openxmlformats.org/wordprocessingml/2006/main" xmlns:w14="http://schemas.microsoft.com/office/word/2010/wordml" xmlns:w15="http://schemas.microsoft.com/office/word/2012/wordml" xmlns:w16cex="http://schemas.microsoft.com/office/word/2018/wordml/cex" xmlns:w16cid="http://schemas.microsoft.com/office/word/2016/wordml/cid" xmlns:w16="http://schemas.microsoft.com/office/word/2018/wordml" xmlns:w16sdtdh="http://schemas.microsoft.com/office/word/2020/wordml/sdtdatahash" xmlns:w16se="http://schemas.microsoft.com/office/word/2015/wordml/symex" xmlns:wpg="http://schemas.microsoft.com/office/word/2010/wordprocessingGroup" xmlns:wpi="http://schemas.microsoft.com/office/word/2010/wordprocessingInk" xmlns:wne="http://schemas.microsoft.com/office/word/2006/wordml" xmlns:wps="http://schemas.microsoft.com/office/word/2010/wordprocessingShape" mc:Ignorable="w14 w15 w16se w16cid w16 w16cex w16sdtdh wp14">
   <w:p>
     <w:pPr>
-      <w:pStyle w:val="En-tte"/>
+      <w:rPr>
+        <w:rFonts w:ascii="Avenir" w:hAnsi="Avenir"/>
+      </w:rPr>
     </w:pPr>
     <w:r>
       <w:rPr>
@@ -1332,49 +1248,10 @@
     </w:r>
     <w:r>
       <w:rPr>
-        <w:noProof/>
+        <w:rFonts w:ascii="Avenir" w:hAnsi="Avenir"/>
+        <w:lang w:val="en-US"/>
       </w:rPr>
-      <w:drawing>
-        <wp:inline distT="0" distB="0" distL="0" distR="0" wp14:anchorId="31B6D394" wp14:editId="509D4AA3">
-          <wp:extent cx="1533525" cy="734060"/>
-          <wp:effectExtent l="0" t="0" r="9525" b="8890"/>
-          <wp:docPr id="667687861" name="Image 3"/>
-          <wp:cNvGraphicFramePr>
-            <a:graphicFrameLocks xmlns:a="http://schemas.openxmlformats.org/drawingml/2006/main" noChangeAspect="1"/>
-          </wp:cNvGraphicFramePr>
-          <a:graphic xmlns:a="http://schemas.openxmlformats.org/drawingml/2006/main">
-            <a:graphicData uri="http://schemas.openxmlformats.org/drawingml/2006/picture">
-              <pic:pic xmlns:pic="http://schemas.openxmlformats.org/drawingml/2006/picture">
-                <pic:nvPicPr>
-                  <pic:cNvPr id="667687861" name="Image 667687861"/>
-                  <pic:cNvPicPr/>
-                </pic:nvPicPr>
-                <pic:blipFill>
-                  <a:blip r:embed="rId1">
-                    <a:extLst>
-                      <a:ext uri="{28A0092B-C50C-407E-A947-70E740481C1C}">
-                        <a14:useLocalDpi xmlns:a14="http://schemas.microsoft.com/office/drawing/2010/main" val="0"/>
-                      </a:ext>
-                    </a:extLst>
-                  </a:blip>
-                  <a:stretch>
-                    <a:fillRect/>
-                  </a:stretch>
-                </pic:blipFill>
-                <pic:spPr>
-                  <a:xfrm>
-                    <a:off x="0" y="0"/>
-                    <a:ext cx="1581597" cy="757071"/>
-                  </a:xfrm>
-                  <a:prstGeom prst="rect">
-                    <a:avLst/>
-                  </a:prstGeom>
-                </pic:spPr>
-              </pic:pic>
-            </a:graphicData>
-          </a:graphic>
-        </wp:inline>
-      </w:drawing>
+      <w:t>«LOGO_SOC»</w:t>
     </w:r>
   </w:p>
   <w:p>

</xml_diff>

<commit_message>
Correction Mouvement sur les police
</commit_message>
<xml_diff>
--- a/src/production/templates/police/courriers/Appel de prime.docx
+++ b/src/production/templates/police/courriers/Appel de prime.docx
@@ -1,6 +1,6 @@
 
 <file path=word/document.xml><?xml version="1.0" encoding="utf-8"?>
-<w:document xmlns:wpc="http://schemas.microsoft.com/office/word/2010/wordprocessingCanvas" xmlns:cx="http://schemas.microsoft.com/office/drawing/2014/chartex" xmlns:cx1="http://schemas.microsoft.com/office/drawing/2015/9/8/chartex" xmlns:cx2="http://schemas.microsoft.com/office/drawing/2015/10/21/chartex" xmlns:cx3="http://schemas.microsoft.com/office/drawing/2016/5/9/chartex" xmlns:cx4="http://schemas.microsoft.com/office/drawing/2016/5/10/chartex" xmlns:cx5="http://schemas.microsoft.com/office/drawing/2016/5/11/chartex" xmlns:cx6="http://schemas.microsoft.com/office/drawing/2016/5/12/chartex" xmlns:cx7="http://schemas.microsoft.com/office/drawing/2016/5/13/chartex" xmlns:cx8="http://schemas.microsoft.com/office/drawing/2016/5/14/chartex" xmlns:mc="http://schemas.openxmlformats.org/markup-compatibility/2006" xmlns:aink="http://schemas.microsoft.com/office/drawing/2016/ink" xmlns:am3d="http://schemas.microsoft.com/office/drawing/2017/model3d" xmlns:o="urn:schemas-microsoft-com:office:office" xmlns:oel="http://schemas.microsoft.com/office/2019/extlst" xmlns:r="http://schemas.openxmlformats.org/officeDocument/2006/relationships" xmlns:m="http://schemas.openxmlformats.org/officeDocument/2006/math" xmlns:v="urn:schemas-microsoft-com:vml" xmlns:wp14="http://schemas.microsoft.com/office/word/2010/wordprocessingDrawing" xmlns:wp="http://schemas.openxmlformats.org/drawingml/2006/wordprocessingDrawing" xmlns:w10="urn:schemas-microsoft-com:office:word" xmlns:w="http://schemas.openxmlformats.org/wordprocessingml/2006/main" xmlns:w14="http://schemas.microsoft.com/office/word/2010/wordml" xmlns:w15="http://schemas.microsoft.com/office/word/2012/wordml" xmlns:w16cex="http://schemas.microsoft.com/office/word/2018/wordml/cex" xmlns:w16cid="http://schemas.microsoft.com/office/word/2016/wordml/cid" xmlns:w16="http://schemas.microsoft.com/office/word/2018/wordml" xmlns:w16sdtdh="http://schemas.microsoft.com/office/word/2020/wordml/sdtdatahash" xmlns:w16se="http://schemas.microsoft.com/office/word/2015/wordml/symex" xmlns:wpg="http://schemas.microsoft.com/office/word/2010/wordprocessingGroup" xmlns:wpi="http://schemas.microsoft.com/office/word/2010/wordprocessingInk" xmlns:wne="http://schemas.microsoft.com/office/word/2006/wordml" xmlns:wps="http://schemas.microsoft.com/office/word/2010/wordprocessingShape" mc:Ignorable="w14 w15 w16se w16cid w16 w16cex w16sdtdh wp14">
+<w:document xmlns:wpc="http://schemas.microsoft.com/office/word/2010/wordprocessingCanvas" xmlns:cx="http://schemas.microsoft.com/office/drawing/2014/chartex" xmlns:cx1="http://schemas.microsoft.com/office/drawing/2015/9/8/chartex" xmlns:cx2="http://schemas.microsoft.com/office/drawing/2015/10/21/chartex" xmlns:cx3="http://schemas.microsoft.com/office/drawing/2016/5/9/chartex" xmlns:cx4="http://schemas.microsoft.com/office/drawing/2016/5/10/chartex" xmlns:cx5="http://schemas.microsoft.com/office/drawing/2016/5/11/chartex" xmlns:cx6="http://schemas.microsoft.com/office/drawing/2016/5/12/chartex" xmlns:cx7="http://schemas.microsoft.com/office/drawing/2016/5/13/chartex" xmlns:cx8="http://schemas.microsoft.com/office/drawing/2016/5/14/chartex" xmlns:mc="http://schemas.openxmlformats.org/markup-compatibility/2006" xmlns:aink="http://schemas.microsoft.com/office/drawing/2016/ink" xmlns:am3d="http://schemas.microsoft.com/office/drawing/2017/model3d" xmlns:o="urn:schemas-microsoft-com:office:office" xmlns:oel="http://schemas.microsoft.com/office/2019/extlst" xmlns:r="http://schemas.openxmlformats.org/officeDocument/2006/relationships" xmlns:m="http://schemas.openxmlformats.org/officeDocument/2006/math" xmlns:v="urn:schemas-microsoft-com:vml" xmlns:wp14="http://schemas.microsoft.com/office/word/2010/wordprocessingDrawing" xmlns:wp="http://schemas.openxmlformats.org/drawingml/2006/wordprocessingDrawing" xmlns:w10="urn:schemas-microsoft-com:office:word" xmlns:w="http://schemas.openxmlformats.org/wordprocessingml/2006/main" xmlns:w14="http://schemas.microsoft.com/office/word/2010/wordml" xmlns:w15="http://schemas.microsoft.com/office/word/2012/wordml" xmlns:w16cex="http://schemas.microsoft.com/office/word/2018/wordml/cex" xmlns:w16cid="http://schemas.microsoft.com/office/word/2016/wordml/cid" xmlns:w16="http://schemas.microsoft.com/office/word/2018/wordml" xmlns:w16du="http://schemas.microsoft.com/office/word/2023/wordml/word16du" xmlns:w16sdtdh="http://schemas.microsoft.com/office/word/2020/wordml/sdtdatahash" xmlns:w16sdtfl="http://schemas.microsoft.com/office/word/2024/wordml/sdtformatlock" xmlns:w16se="http://schemas.microsoft.com/office/word/2015/wordml/symex" xmlns:wpg="http://schemas.microsoft.com/office/word/2010/wordprocessingGroup" xmlns:wpi="http://schemas.microsoft.com/office/word/2010/wordprocessingInk" xmlns:wne="http://schemas.microsoft.com/office/word/2006/wordml" xmlns:wps="http://schemas.microsoft.com/office/word/2010/wordprocessingShape" mc:Ignorable="w14 w15 w16se w16cid w16 w16cex w16sdtdh w16sdtfl w16du wp14">
   <w:body>
     <w:tbl>
       <w:tblPr>
@@ -69,68 +69,67 @@
             <w:r>
               <w:t xml:space="preserve">    </w:t>
             </w:r>
-            <w:proofErr w:type="gramStart"/>
             <w:r>
               <w:t>«</w:t>
             </w:r>
             <w:r>
-              <w:t>NOM</w:t>
-            </w:r>
-            <w:proofErr w:type="gramEnd"/>
+              <w:t>NOM_CLIENT</w:t>
+            </w:r>
+            <w:r>
+              <w:t xml:space="preserve">»                                                                                                           </w:t>
+            </w:r>
+          </w:p>
+          <w:p>
+            <w:pPr>
+              <w:spacing w:after="160" w:line="259" w:lineRule="auto"/>
+            </w:pPr>
+          </w:p>
+          <w:p>
+            <w:pPr>
+              <w:spacing w:after="160" w:line="259" w:lineRule="auto"/>
+            </w:pPr>
+            <w:r>
+              <w:t xml:space="preserve">        </w:t>
+            </w:r>
+            <w:r>
+              <w:t xml:space="preserve">     </w:t>
+            </w:r>
+            <w:r>
+              <w:t xml:space="preserve"> Abidjan, </w:t>
+            </w:r>
+            <w:r>
+              <w:t>le «</w:t>
+            </w:r>
+            <w:r>
+              <w:t>DATE_JOUR</w:t>
+            </w:r>
+            <w:r>
+              <w:t>»</w:t>
+            </w:r>
+          </w:p>
+          <w:p>
+            <w:pPr>
+              <w:spacing w:after="160" w:line="259" w:lineRule="auto"/>
+            </w:pPr>
+          </w:p>
+          <w:p>
+            <w:pPr>
+              <w:spacing w:after="160" w:line="259" w:lineRule="auto"/>
+            </w:pPr>
+            <w:r>
+              <w:t xml:space="preserve">               </w:t>
+            </w:r>
+            <w:r>
+              <w:t>«</w:t>
+            </w:r>
+            <w:r>
+              <w:t>ADRESS</w:t>
+            </w:r>
             <w:r>
               <w:t>_CLIENT</w:t>
             </w:r>
             <w:r>
               <w:t xml:space="preserve">»                                                                                                           </w:t>
-            </w:r>
-          </w:p>
-          <w:p>
-            <w:pPr>
-              <w:spacing w:after="160" w:line="259" w:lineRule="auto"/>
-            </w:pPr>
-          </w:p>
-          <w:p>
-            <w:pPr>
-              <w:spacing w:after="160" w:line="259" w:lineRule="auto"/>
-            </w:pPr>
-            <w:r>
-              <w:t xml:space="preserve">        </w:t>
-            </w:r>
-            <w:r>
-              <w:t xml:space="preserve">     </w:t>
-            </w:r>
-            <w:r>
-              <w:t xml:space="preserve"> </w:t>
-            </w:r>
-            <w:proofErr w:type="gramStart"/>
-            <w:r>
-              <w:rPr>
-                <w:rFonts w:ascii="Avenir" w:hAnsi="Avenir" w:cstheme="minorHAnsi"/>
-                <w:sz w:val="24"/>
-                <w:szCs w:val="24"/>
-              </w:rPr>
-              <w:t>«CABINET</w:t>
-            </w:r>
-            <w:proofErr w:type="gramEnd"/>
-            <w:r>
-              <w:rPr>
-                <w:rFonts w:ascii="Avenir" w:hAnsi="Avenir" w:cstheme="minorHAnsi"/>
-                <w:sz w:val="24"/>
-                <w:szCs w:val="24"/>
-              </w:rPr>
-              <w:t>_VILLECAB»</w:t>
-            </w:r>
-            <w:r>
-              <w:t xml:space="preserve">, </w:t>
-            </w:r>
-            <w:r>
-              <w:t>le «</w:t>
-            </w:r>
-            <w:r>
-              <w:t>DATE_JOUR</w:t>
-            </w:r>
-            <w:r>
-              <w:t>»</w:t>
             </w:r>
           </w:p>
           <w:p>
@@ -229,16 +228,6 @@
               <w:spacing w:after="160" w:line="259" w:lineRule="auto"/>
             </w:pPr>
           </w:p>
-          <w:p>
-            <w:pPr>
-              <w:spacing w:after="160" w:line="259" w:lineRule="auto"/>
-            </w:pPr>
-          </w:p>
-          <w:p>
-            <w:pPr>
-              <w:spacing w:after="160" w:line="259" w:lineRule="auto"/>
-            </w:pPr>
-          </w:p>
         </w:tc>
         <w:tc>
           <w:tcPr>
@@ -260,6 +249,283 @@
             <w:vAlign w:val="center"/>
             <w:hideMark/>
           </w:tcPr>
+          <w:p>
+            <w:pPr>
+              <w:spacing w:after="160" w:line="259" w:lineRule="auto"/>
+            </w:pPr>
+          </w:p>
+        </w:tc>
+      </w:tr>
+      <w:tr>
+        <w:tc>
+          <w:tcPr>
+            <w:tcW w:w="3402" w:type="dxa"/>
+          </w:tcPr>
+          <w:p>
+            <w:pPr>
+              <w:spacing w:after="160" w:line="259" w:lineRule="auto"/>
+              <w:rPr>
+                <w:b/>
+              </w:rPr>
+            </w:pPr>
+          </w:p>
+        </w:tc>
+        <w:tc>
+          <w:tcPr>
+            <w:tcW w:w="0" w:type="auto"/>
+            <w:vMerge/>
+            <w:vAlign w:val="center"/>
+            <w:hideMark/>
+          </w:tcPr>
+          <w:p>
+            <w:pPr>
+              <w:spacing w:after="160" w:line="259" w:lineRule="auto"/>
+            </w:pPr>
+          </w:p>
+        </w:tc>
+        <w:tc>
+          <w:tcPr>
+            <w:tcW w:w="0" w:type="auto"/>
+            <w:vMerge/>
+            <w:vAlign w:val="center"/>
+            <w:hideMark/>
+          </w:tcPr>
+          <w:p>
+            <w:pPr>
+              <w:spacing w:after="160" w:line="259" w:lineRule="auto"/>
+            </w:pPr>
+          </w:p>
+        </w:tc>
+      </w:tr>
+      <w:tr>
+        <w:tc>
+          <w:tcPr>
+            <w:tcW w:w="3402" w:type="dxa"/>
+          </w:tcPr>
+          <w:p>
+            <w:pPr>
+              <w:spacing w:after="160" w:line="259" w:lineRule="auto"/>
+            </w:pPr>
+          </w:p>
+        </w:tc>
+        <w:tc>
+          <w:tcPr>
+            <w:tcW w:w="0" w:type="auto"/>
+            <w:vMerge/>
+            <w:vAlign w:val="center"/>
+            <w:hideMark/>
+          </w:tcPr>
+          <w:p>
+            <w:pPr>
+              <w:spacing w:after="160" w:line="259" w:lineRule="auto"/>
+            </w:pPr>
+          </w:p>
+        </w:tc>
+        <w:tc>
+          <w:tcPr>
+            <w:tcW w:w="0" w:type="auto"/>
+            <w:vMerge/>
+            <w:vAlign w:val="center"/>
+            <w:hideMark/>
+          </w:tcPr>
+          <w:p>
+            <w:pPr>
+              <w:spacing w:after="160" w:line="259" w:lineRule="auto"/>
+            </w:pPr>
+          </w:p>
+        </w:tc>
+      </w:tr>
+      <w:tr>
+        <w:tc>
+          <w:tcPr>
+            <w:tcW w:w="3402" w:type="dxa"/>
+          </w:tcPr>
+          <w:p>
+            <w:pPr>
+              <w:spacing w:after="160" w:line="259" w:lineRule="auto"/>
+              <w:rPr>
+                <w:b/>
+              </w:rPr>
+            </w:pPr>
+          </w:p>
+        </w:tc>
+        <w:tc>
+          <w:tcPr>
+            <w:tcW w:w="0" w:type="auto"/>
+            <w:vMerge/>
+            <w:vAlign w:val="center"/>
+            <w:hideMark/>
+          </w:tcPr>
+          <w:p>
+            <w:pPr>
+              <w:spacing w:after="160" w:line="259" w:lineRule="auto"/>
+            </w:pPr>
+          </w:p>
+        </w:tc>
+        <w:tc>
+          <w:tcPr>
+            <w:tcW w:w="0" w:type="auto"/>
+            <w:vMerge/>
+            <w:vAlign w:val="center"/>
+            <w:hideMark/>
+          </w:tcPr>
+          <w:p>
+            <w:pPr>
+              <w:spacing w:after="160" w:line="259" w:lineRule="auto"/>
+            </w:pPr>
+          </w:p>
+        </w:tc>
+      </w:tr>
+      <w:tr>
+        <w:tc>
+          <w:tcPr>
+            <w:tcW w:w="3402" w:type="dxa"/>
+          </w:tcPr>
+          <w:p>
+            <w:pPr>
+              <w:spacing w:after="160" w:line="259" w:lineRule="auto"/>
+            </w:pPr>
+          </w:p>
+        </w:tc>
+        <w:tc>
+          <w:tcPr>
+            <w:tcW w:w="0" w:type="auto"/>
+            <w:vMerge/>
+            <w:vAlign w:val="center"/>
+            <w:hideMark/>
+          </w:tcPr>
+          <w:p>
+            <w:pPr>
+              <w:spacing w:after="160" w:line="259" w:lineRule="auto"/>
+            </w:pPr>
+          </w:p>
+        </w:tc>
+        <w:tc>
+          <w:tcPr>
+            <w:tcW w:w="0" w:type="auto"/>
+            <w:vMerge/>
+            <w:vAlign w:val="center"/>
+            <w:hideMark/>
+          </w:tcPr>
+          <w:p>
+            <w:pPr>
+              <w:spacing w:after="160" w:line="259" w:lineRule="auto"/>
+            </w:pPr>
+          </w:p>
+        </w:tc>
+      </w:tr>
+      <w:tr>
+        <w:tc>
+          <w:tcPr>
+            <w:tcW w:w="3402" w:type="dxa"/>
+          </w:tcPr>
+          <w:p>
+            <w:pPr>
+              <w:spacing w:after="160" w:line="259" w:lineRule="auto"/>
+              <w:rPr>
+                <w:b/>
+              </w:rPr>
+            </w:pPr>
+          </w:p>
+        </w:tc>
+        <w:tc>
+          <w:tcPr>
+            <w:tcW w:w="0" w:type="auto"/>
+            <w:vMerge/>
+            <w:vAlign w:val="center"/>
+            <w:hideMark/>
+          </w:tcPr>
+          <w:p>
+            <w:pPr>
+              <w:spacing w:after="160" w:line="259" w:lineRule="auto"/>
+            </w:pPr>
+          </w:p>
+        </w:tc>
+        <w:tc>
+          <w:tcPr>
+            <w:tcW w:w="0" w:type="auto"/>
+            <w:vMerge/>
+            <w:vAlign w:val="center"/>
+            <w:hideMark/>
+          </w:tcPr>
+          <w:p>
+            <w:pPr>
+              <w:spacing w:after="160" w:line="259" w:lineRule="auto"/>
+            </w:pPr>
+          </w:p>
+        </w:tc>
+      </w:tr>
+      <w:tr>
+        <w:tc>
+          <w:tcPr>
+            <w:tcW w:w="3402" w:type="dxa"/>
+          </w:tcPr>
+          <w:p>
+            <w:pPr>
+              <w:spacing w:after="160" w:line="259" w:lineRule="auto"/>
+            </w:pPr>
+          </w:p>
+        </w:tc>
+        <w:tc>
+          <w:tcPr>
+            <w:tcW w:w="0" w:type="auto"/>
+            <w:vMerge/>
+            <w:vAlign w:val="center"/>
+            <w:hideMark/>
+          </w:tcPr>
+          <w:p>
+            <w:pPr>
+              <w:spacing w:after="160" w:line="259" w:lineRule="auto"/>
+            </w:pPr>
+          </w:p>
+        </w:tc>
+        <w:tc>
+          <w:tcPr>
+            <w:tcW w:w="0" w:type="auto"/>
+            <w:vMerge/>
+            <w:vAlign w:val="center"/>
+            <w:hideMark/>
+          </w:tcPr>
+          <w:p>
+            <w:pPr>
+              <w:spacing w:after="160" w:line="259" w:lineRule="auto"/>
+            </w:pPr>
+          </w:p>
+        </w:tc>
+      </w:tr>
+      <w:tr>
+        <w:tc>
+          <w:tcPr>
+            <w:tcW w:w="3402" w:type="dxa"/>
+          </w:tcPr>
+          <w:p>
+            <w:pPr>
+              <w:spacing w:after="160" w:line="259" w:lineRule="auto"/>
+              <w:rPr>
+                <w:b/>
+              </w:rPr>
+            </w:pPr>
+          </w:p>
+        </w:tc>
+        <w:tc>
+          <w:tcPr>
+            <w:tcW w:w="1474" w:type="dxa"/>
+          </w:tcPr>
+          <w:p>
+            <w:pPr>
+              <w:spacing w:after="160" w:line="259" w:lineRule="auto"/>
+            </w:pPr>
+          </w:p>
+        </w:tc>
+        <w:tc>
+          <w:tcPr>
+            <w:tcW w:w="4989" w:type="dxa"/>
+          </w:tcPr>
+          <w:p>
+            <w:pPr>
+              <w:spacing w:after="160" w:line="259" w:lineRule="auto"/>
+            </w:pPr>
+          </w:p>
           <w:p>
             <w:pPr>
               <w:spacing w:after="160" w:line="259" w:lineRule="auto"/>
@@ -321,7 +587,6 @@
                 <w:b/>
               </w:rPr>
             </w:pPr>
-            <w:proofErr w:type="gramStart"/>
             <w:r>
               <w:rPr>
                 <w:b/>
@@ -334,7 +599,6 @@
               </w:rPr>
               <w:t>COMPAGNIE</w:t>
             </w:r>
-            <w:proofErr w:type="gramEnd"/>
             <w:r>
               <w:rPr>
                 <w:b/>
@@ -386,7 +650,6 @@
                 <w:b/>
               </w:rPr>
             </w:pPr>
-            <w:proofErr w:type="gramStart"/>
             <w:r>
               <w:rPr>
                 <w:b/>
@@ -397,14 +660,7 @@
               <w:rPr>
                 <w:b/>
               </w:rPr>
-              <w:t>NOM</w:t>
-            </w:r>
-            <w:proofErr w:type="gramEnd"/>
-            <w:r>
-              <w:rPr>
-                <w:b/>
-              </w:rPr>
-              <w:t>_PRODUIT</w:t>
+              <w:t>NOM_PRODUIT</w:t>
             </w:r>
             <w:r>
               <w:rPr>
@@ -464,7 +720,6 @@
                 <w:b/>
               </w:rPr>
             </w:pPr>
-            <w:proofErr w:type="gramStart"/>
             <w:r>
               <w:rPr>
                 <w:b/>
@@ -475,14 +730,7 @@
               <w:rPr>
                 <w:b/>
               </w:rPr>
-              <w:t>NUMERO</w:t>
-            </w:r>
-            <w:proofErr w:type="gramEnd"/>
-            <w:r>
-              <w:rPr>
-                <w:b/>
-              </w:rPr>
-              <w:t>_POLICE</w:t>
+              <w:t>NUMERO_POLICE</w:t>
             </w:r>
             <w:r>
               <w:rPr>
@@ -498,19 +746,11 @@
                 <w:b/>
               </w:rPr>
             </w:pPr>
-            <w:proofErr w:type="gramStart"/>
-            <w:r>
-              <w:rPr>
-                <w:b/>
-              </w:rPr>
-              <w:t>«QUITTANCE</w:t>
-            </w:r>
-            <w:proofErr w:type="gramEnd"/>
-            <w:r>
-              <w:rPr>
-                <w:b/>
-              </w:rPr>
-              <w:t>_NUMÉRO»</w:t>
+            <w:r>
+              <w:rPr>
+                <w:b/>
+              </w:rPr>
+              <w:t>«QUITTANCE_NUMÉRO»</w:t>
             </w:r>
           </w:p>
         </w:tc>
@@ -557,7 +797,6 @@
                 <w:b/>
               </w:rPr>
             </w:pPr>
-            <w:proofErr w:type="gramStart"/>
             <w:r>
               <w:rPr>
                 <w:b/>
@@ -568,14 +807,7 @@
               <w:rPr>
                 <w:b/>
               </w:rPr>
-              <w:t>DATE</w:t>
-            </w:r>
-            <w:proofErr w:type="gramEnd"/>
-            <w:r>
-              <w:rPr>
-                <w:b/>
-              </w:rPr>
-              <w:t>_DEBUT_EFFET</w:t>
+              <w:t>DATE_DEBUT_EFFET</w:t>
             </w:r>
             <w:r>
               <w:rPr>
@@ -684,44 +916,6 @@
       </w:tr>
     </w:tbl>
     <w:p/>
-    <w:p>
-      <w:r>
-        <w:t>Arrêté le présent appel de prime à la somme de :</w:t>
-      </w:r>
-    </w:p>
-    <w:p>
-      <w:pPr>
-        <w:rPr>
-          <w:b/>
-        </w:rPr>
-      </w:pPr>
-      <w:proofErr w:type="gramStart"/>
-      <w:r>
-        <w:rPr>
-          <w:b/>
-        </w:rPr>
-        <w:t>«MONTANT</w:t>
-      </w:r>
-      <w:proofErr w:type="gramEnd"/>
-      <w:r>
-        <w:rPr>
-          <w:b/>
-        </w:rPr>
-        <w:t>_RENOUVELLEMENT»</w:t>
-      </w:r>
-      <w:r>
-        <w:rPr>
-          <w:b/>
-        </w:rPr>
-        <w:t xml:space="preserve"> </w:t>
-      </w:r>
-      <w:r>
-        <w:rPr>
-          <w:b/>
-        </w:rPr>
-        <w:t>«EN_LETTRES»</w:t>
-      </w:r>
-    </w:p>
     <w:p>
       <w:pPr>
         <w:rPr>
@@ -732,7 +926,7 @@
         <w:rPr>
           <w:b/>
         </w:rPr>
-        <w:tab/>
+        <w:t>«LETTRES»</w:t>
       </w:r>
     </w:p>
     <w:p>
@@ -741,15 +935,53 @@
           <w:b/>
         </w:rPr>
       </w:pPr>
-    </w:p>
-    <w:p>
-      <w:pPr>
+      <w:r>
+        <w:t>Merci de bien vouloir faire le règlement par chèque à l’ordre de la compagnie</w:t>
+      </w:r>
+      <w:r>
+        <w:t xml:space="preserve"> </w:t>
+      </w:r>
+      <w:r>
         <w:rPr>
           <w:b/>
         </w:rPr>
-      </w:pPr>
+        <w:t>«</w:t>
+      </w:r>
+      <w:r>
+        <w:rPr>
+          <w:b/>
+        </w:rPr>
+        <w:t>COMPAGNIE</w:t>
+      </w:r>
+      <w:r>
+        <w:rPr>
+          <w:b/>
+        </w:rPr>
+        <w:t>»</w:t>
+      </w:r>
+      <w:r>
+        <w:rPr>
+          <w:b/>
+        </w:rPr>
+        <w:t> .</w:t>
+      </w:r>
     </w:p>
-    <w:p/>
+    <w:p>
+      <w:r>
+        <w:t xml:space="preserve">Nous restons en attente de votre règlement et vous remercions de votre confiance </w:t>
+      </w:r>
+      <w:r>
+        <w:t>.</w:t>
+      </w:r>
+    </w:p>
+    <w:p>
+      <w:r>
+        <w:t>Cordialement</w:t>
+      </w:r>
+      <w:r>
+        <w:t xml:space="preserve"> .</w:t>
+      </w:r>
+    </w:p>
     <w:tbl>
       <w:tblPr>
         <w:tblStyle w:val="Grilledutableau"/>
@@ -788,7 +1020,7 @@
                 <w:b/>
                 <w:u w:val="single"/>
               </w:rPr>
-              <w:t>Responsable Production</w:t>
+              <w:t>Signataire</w:t>
             </w:r>
           </w:p>
         </w:tc>
@@ -816,7 +1048,14 @@
                 <w:b/>
                 <w:u w:val="single"/>
               </w:rPr>
-              <w:t>Direction Technique</w:t>
+              <w:t xml:space="preserve">Direction </w:t>
+            </w:r>
+            <w:r>
+              <w:rPr>
+                <w:b/>
+                <w:u w:val="single"/>
+              </w:rPr>
+              <w:t>de la production</w:t>
             </w:r>
           </w:p>
         </w:tc>
@@ -852,6 +1091,33 @@
         </w:tc>
       </w:tr>
     </w:tbl>
+    <w:p>
+      <w:pPr>
+        <w:rPr>
+          <w:b/>
+          <w:i/>
+          <w:u w:val="single"/>
+        </w:rPr>
+      </w:pPr>
+    </w:p>
+    <w:p>
+      <w:pPr>
+        <w:rPr>
+          <w:b/>
+          <w:i/>
+          <w:u w:val="single"/>
+        </w:rPr>
+      </w:pPr>
+    </w:p>
+    <w:p>
+      <w:pPr>
+        <w:rPr>
+          <w:b/>
+          <w:i/>
+          <w:u w:val="single"/>
+        </w:rPr>
+      </w:pPr>
+    </w:p>
     <w:p>
       <w:pPr>
         <w:rPr>
@@ -873,7 +1139,7 @@
 </file>
 
 <file path=word/endnotes.xml><?xml version="1.0" encoding="utf-8"?>
-<w:endnotes xmlns:wpc="http://schemas.microsoft.com/office/word/2010/wordprocessingCanvas" xmlns:cx="http://schemas.microsoft.com/office/drawing/2014/chartex" xmlns:cx1="http://schemas.microsoft.com/office/drawing/2015/9/8/chartex" xmlns:cx2="http://schemas.microsoft.com/office/drawing/2015/10/21/chartex" xmlns:cx3="http://schemas.microsoft.com/office/drawing/2016/5/9/chartex" xmlns:cx4="http://schemas.microsoft.com/office/drawing/2016/5/10/chartex" xmlns:cx5="http://schemas.microsoft.com/office/drawing/2016/5/11/chartex" xmlns:cx6="http://schemas.microsoft.com/office/drawing/2016/5/12/chartex" xmlns:cx7="http://schemas.microsoft.com/office/drawing/2016/5/13/chartex" xmlns:cx8="http://schemas.microsoft.com/office/drawing/2016/5/14/chartex" xmlns:mc="http://schemas.openxmlformats.org/markup-compatibility/2006" xmlns:aink="http://schemas.microsoft.com/office/drawing/2016/ink" xmlns:am3d="http://schemas.microsoft.com/office/drawing/2017/model3d" xmlns:o="urn:schemas-microsoft-com:office:office" xmlns:oel="http://schemas.microsoft.com/office/2019/extlst" xmlns:r="http://schemas.openxmlformats.org/officeDocument/2006/relationships" xmlns:m="http://schemas.openxmlformats.org/officeDocument/2006/math" xmlns:v="urn:schemas-microsoft-com:vml" xmlns:wp14="http://schemas.microsoft.com/office/word/2010/wordprocessingDrawing" xmlns:wp="http://schemas.openxmlformats.org/drawingml/2006/wordprocessingDrawing" xmlns:w10="urn:schemas-microsoft-com:office:word" xmlns:w="http://schemas.openxmlformats.org/wordprocessingml/2006/main" xmlns:w14="http://schemas.microsoft.com/office/word/2010/wordml" xmlns:w15="http://schemas.microsoft.com/office/word/2012/wordml" xmlns:w16cex="http://schemas.microsoft.com/office/word/2018/wordml/cex" xmlns:w16cid="http://schemas.microsoft.com/office/word/2016/wordml/cid" xmlns:w16="http://schemas.microsoft.com/office/word/2018/wordml" xmlns:w16sdtdh="http://schemas.microsoft.com/office/word/2020/wordml/sdtdatahash" xmlns:w16se="http://schemas.microsoft.com/office/word/2015/wordml/symex" xmlns:wpg="http://schemas.microsoft.com/office/word/2010/wordprocessingGroup" xmlns:wpi="http://schemas.microsoft.com/office/word/2010/wordprocessingInk" xmlns:wne="http://schemas.microsoft.com/office/word/2006/wordml" xmlns:wps="http://schemas.microsoft.com/office/word/2010/wordprocessingShape" mc:Ignorable="w14 w15 w16se w16cid w16 w16cex w16sdtdh wp14">
+<w:endnotes xmlns:wpc="http://schemas.microsoft.com/office/word/2010/wordprocessingCanvas" xmlns:cx="http://schemas.microsoft.com/office/drawing/2014/chartex" xmlns:cx1="http://schemas.microsoft.com/office/drawing/2015/9/8/chartex" xmlns:cx2="http://schemas.microsoft.com/office/drawing/2015/10/21/chartex" xmlns:cx3="http://schemas.microsoft.com/office/drawing/2016/5/9/chartex" xmlns:cx4="http://schemas.microsoft.com/office/drawing/2016/5/10/chartex" xmlns:cx5="http://schemas.microsoft.com/office/drawing/2016/5/11/chartex" xmlns:cx6="http://schemas.microsoft.com/office/drawing/2016/5/12/chartex" xmlns:cx7="http://schemas.microsoft.com/office/drawing/2016/5/13/chartex" xmlns:cx8="http://schemas.microsoft.com/office/drawing/2016/5/14/chartex" xmlns:mc="http://schemas.openxmlformats.org/markup-compatibility/2006" xmlns:aink="http://schemas.microsoft.com/office/drawing/2016/ink" xmlns:am3d="http://schemas.microsoft.com/office/drawing/2017/model3d" xmlns:o="urn:schemas-microsoft-com:office:office" xmlns:oel="http://schemas.microsoft.com/office/2019/extlst" xmlns:r="http://schemas.openxmlformats.org/officeDocument/2006/relationships" xmlns:m="http://schemas.openxmlformats.org/officeDocument/2006/math" xmlns:v="urn:schemas-microsoft-com:vml" xmlns:wp14="http://schemas.microsoft.com/office/word/2010/wordprocessingDrawing" xmlns:wp="http://schemas.openxmlformats.org/drawingml/2006/wordprocessingDrawing" xmlns:w10="urn:schemas-microsoft-com:office:word" xmlns:w="http://schemas.openxmlformats.org/wordprocessingml/2006/main" xmlns:w14="http://schemas.microsoft.com/office/word/2010/wordml" xmlns:w15="http://schemas.microsoft.com/office/word/2012/wordml" xmlns:w16cex="http://schemas.microsoft.com/office/word/2018/wordml/cex" xmlns:w16cid="http://schemas.microsoft.com/office/word/2016/wordml/cid" xmlns:w16="http://schemas.microsoft.com/office/word/2018/wordml" xmlns:w16du="http://schemas.microsoft.com/office/word/2023/wordml/word16du" xmlns:w16sdtdh="http://schemas.microsoft.com/office/word/2020/wordml/sdtdatahash" xmlns:w16sdtfl="http://schemas.microsoft.com/office/word/2024/wordml/sdtformatlock" xmlns:w16se="http://schemas.microsoft.com/office/word/2015/wordml/symex" xmlns:wpg="http://schemas.microsoft.com/office/word/2010/wordprocessingGroup" xmlns:wpi="http://schemas.microsoft.com/office/word/2010/wordprocessingInk" xmlns:wne="http://schemas.microsoft.com/office/word/2006/wordml" xmlns:wps="http://schemas.microsoft.com/office/word/2010/wordprocessingShape" mc:Ignorable="w14 w15 w16se w16cid w16 w16cex w16sdtdh w16sdtfl w16du wp14">
   <w:endnote w:type="separator" w:id="-1">
     <w:p>
       <w:pPr>
@@ -898,188 +1164,101 @@
 </file>
 
 <file path=word/footer1.xml><?xml version="1.0" encoding="utf-8"?>
-<w:ftr xmlns:wpc="http://schemas.microsoft.com/office/word/2010/wordprocessingCanvas" xmlns:cx="http://schemas.microsoft.com/office/drawing/2014/chartex" xmlns:cx1="http://schemas.microsoft.com/office/drawing/2015/9/8/chartex" xmlns:cx2="http://schemas.microsoft.com/office/drawing/2015/10/21/chartex" xmlns:cx3="http://schemas.microsoft.com/office/drawing/2016/5/9/chartex" xmlns:cx4="http://schemas.microsoft.com/office/drawing/2016/5/10/chartex" xmlns:cx5="http://schemas.microsoft.com/office/drawing/2016/5/11/chartex" xmlns:cx6="http://schemas.microsoft.com/office/drawing/2016/5/12/chartex" xmlns:cx7="http://schemas.microsoft.com/office/drawing/2016/5/13/chartex" xmlns:cx8="http://schemas.microsoft.com/office/drawing/2016/5/14/chartex" xmlns:mc="http://schemas.openxmlformats.org/markup-compatibility/2006" xmlns:aink="http://schemas.microsoft.com/office/drawing/2016/ink" xmlns:am3d="http://schemas.microsoft.com/office/drawing/2017/model3d" xmlns:o="urn:schemas-microsoft-com:office:office" xmlns:oel="http://schemas.microsoft.com/office/2019/extlst" xmlns:r="http://schemas.openxmlformats.org/officeDocument/2006/relationships" xmlns:m="http://schemas.openxmlformats.org/officeDocument/2006/math" xmlns:v="urn:schemas-microsoft-com:vml" xmlns:wp14="http://schemas.microsoft.com/office/word/2010/wordprocessingDrawing" xmlns:wp="http://schemas.openxmlformats.org/drawingml/2006/wordprocessingDrawing" xmlns:w10="urn:schemas-microsoft-com:office:word" xmlns:w="http://schemas.openxmlformats.org/wordprocessingml/2006/main" xmlns:w14="http://schemas.microsoft.com/office/word/2010/wordml" xmlns:w15="http://schemas.microsoft.com/office/word/2012/wordml" xmlns:w16cex="http://schemas.microsoft.com/office/word/2018/wordml/cex" xmlns:w16cid="http://schemas.microsoft.com/office/word/2016/wordml/cid" xmlns:w16="http://schemas.microsoft.com/office/word/2018/wordml" xmlns:w16sdtdh="http://schemas.microsoft.com/office/word/2020/wordml/sdtdatahash" xmlns:w16se="http://schemas.microsoft.com/office/word/2015/wordml/symex" xmlns:wpg="http://schemas.microsoft.com/office/word/2010/wordprocessingGroup" xmlns:wpi="http://schemas.microsoft.com/office/word/2010/wordprocessingInk" xmlns:wne="http://schemas.microsoft.com/office/word/2006/wordml" xmlns:wps="http://schemas.microsoft.com/office/word/2010/wordprocessingShape" mc:Ignorable="w14 w15 w16se w16cid w16 w16cex w16sdtdh wp14">
-  <w:tbl>
-    <w:tblPr>
-      <w:tblStyle w:val="Grilledutableau"/>
-      <w:tblpPr w:leftFromText="142" w:rightFromText="142" w:vertAnchor="text" w:horzAnchor="page" w:tblpX="568" w:tblpY="1"/>
-      <w:tblOverlap w:val="never"/>
-      <w:tblW w:w="10772" w:type="dxa"/>
-      <w:tblBorders>
-        <w:top w:val="none" w:sz="0" w:space="0" w:color="auto"/>
-        <w:left w:val="none" w:sz="0" w:space="0" w:color="auto"/>
-        <w:bottom w:val="none" w:sz="0" w:space="0" w:color="auto"/>
-        <w:right w:val="none" w:sz="0" w:space="0" w:color="auto"/>
-        <w:insideV w:val="none" w:sz="0" w:space="0" w:color="auto"/>
-      </w:tblBorders>
-      <w:tblLook w:val="04A0" w:firstRow="1" w:lastRow="0" w:firstColumn="1" w:lastColumn="0" w:noHBand="0" w:noVBand="1"/>
-    </w:tblPr>
-    <w:tblGrid>
-      <w:gridCol w:w="10772"/>
-    </w:tblGrid>
-    <w:tr>
-      <w:tc>
-        <w:tcPr>
-          <w:tcW w:w="10772" w:type="dxa"/>
-        </w:tcPr>
-        <w:p>
-          <w:pPr>
-            <w:pStyle w:val="Pieddepage"/>
-            <w:jc w:val="right"/>
-            <w:rPr>
-              <w:color w:val="808080" w:themeColor="background1" w:themeShade="80"/>
-              <w:sz w:val="16"/>
-              <w:szCs w:val="16"/>
-            </w:rPr>
-          </w:pPr>
-          <w:r>
-            <w:rPr>
-              <w:color w:val="808080" w:themeColor="background1" w:themeShade="80"/>
-              <w:sz w:val="16"/>
-              <w:szCs w:val="16"/>
-            </w:rPr>
-            <w:t xml:space="preserve">Page </w:t>
-          </w:r>
-          <w:r>
-            <w:rPr>
-              <w:bCs/>
-              <w:color w:val="808080" w:themeColor="background1" w:themeShade="80"/>
-              <w:sz w:val="16"/>
-              <w:szCs w:val="16"/>
-            </w:rPr>
-            <w:fldChar w:fldCharType="begin"/>
-          </w:r>
-          <w:r>
-            <w:rPr>
-              <w:bCs/>
-              <w:color w:val="808080" w:themeColor="background1" w:themeShade="80"/>
-              <w:sz w:val="16"/>
-              <w:szCs w:val="16"/>
-            </w:rPr>
-            <w:instrText>PAGE  \* Arabic  \* MERGEFORMAT</w:instrText>
-          </w:r>
-          <w:r>
-            <w:rPr>
-              <w:bCs/>
-              <w:color w:val="808080" w:themeColor="background1" w:themeShade="80"/>
-              <w:sz w:val="16"/>
-              <w:szCs w:val="16"/>
-            </w:rPr>
-            <w:fldChar w:fldCharType="separate"/>
-          </w:r>
-          <w:r>
-            <w:rPr>
-              <w:bCs/>
-              <w:noProof/>
-              <w:color w:val="808080" w:themeColor="background1" w:themeShade="80"/>
-              <w:sz w:val="16"/>
-              <w:szCs w:val="16"/>
-            </w:rPr>
-            <w:t>1</w:t>
-          </w:r>
-          <w:r>
-            <w:rPr>
-              <w:bCs/>
-              <w:color w:val="808080" w:themeColor="background1" w:themeShade="80"/>
-              <w:sz w:val="16"/>
-              <w:szCs w:val="16"/>
-            </w:rPr>
-            <w:fldChar w:fldCharType="end"/>
-          </w:r>
-          <w:r>
-            <w:rPr>
-              <w:color w:val="808080" w:themeColor="background1" w:themeShade="80"/>
-              <w:sz w:val="16"/>
-              <w:szCs w:val="16"/>
-            </w:rPr>
-            <w:t xml:space="preserve"> / </w:t>
-          </w:r>
-          <w:r>
-            <w:rPr>
-              <w:bCs/>
-              <w:color w:val="808080" w:themeColor="background1" w:themeShade="80"/>
-              <w:sz w:val="16"/>
-              <w:szCs w:val="16"/>
-            </w:rPr>
-            <w:fldChar w:fldCharType="begin"/>
-          </w:r>
-          <w:r>
-            <w:rPr>
-              <w:bCs/>
-              <w:color w:val="808080" w:themeColor="background1" w:themeShade="80"/>
-              <w:sz w:val="16"/>
-              <w:szCs w:val="16"/>
-            </w:rPr>
-            <w:instrText>NUMPAGES  \* Arabic  \* MERGEFORMAT</w:instrText>
-          </w:r>
-          <w:r>
-            <w:rPr>
-              <w:bCs/>
-              <w:color w:val="808080" w:themeColor="background1" w:themeShade="80"/>
-              <w:sz w:val="16"/>
-              <w:szCs w:val="16"/>
-            </w:rPr>
-            <w:fldChar w:fldCharType="separate"/>
-          </w:r>
-          <w:r>
-            <w:rPr>
-              <w:bCs/>
-              <w:noProof/>
-              <w:color w:val="808080" w:themeColor="background1" w:themeShade="80"/>
-              <w:sz w:val="16"/>
-              <w:szCs w:val="16"/>
-            </w:rPr>
-            <w:t>1</w:t>
-          </w:r>
-          <w:r>
-            <w:rPr>
-              <w:bCs/>
-              <w:color w:val="808080" w:themeColor="background1" w:themeShade="80"/>
-              <w:sz w:val="16"/>
-              <w:szCs w:val="16"/>
-            </w:rPr>
-            <w:fldChar w:fldCharType="end"/>
-          </w:r>
-        </w:p>
-      </w:tc>
-    </w:tr>
-    <w:tr>
-      <w:tc>
-        <w:tcPr>
-          <w:tcW w:w="10772" w:type="dxa"/>
-        </w:tcPr>
-        <w:p>
-          <w:pPr>
-            <w:pStyle w:val="Pieddepage"/>
-            <w:jc w:val="center"/>
-            <w:rPr>
-              <w:color w:val="808080" w:themeColor="background1" w:themeShade="80"/>
-              <w:sz w:val="16"/>
-              <w:szCs w:val="16"/>
-            </w:rPr>
-          </w:pPr>
-          <w:proofErr w:type="gramStart"/>
-          <w:r>
-            <w:rPr>
-              <w:color w:val="808080" w:themeColor="background1" w:themeShade="80"/>
-              <w:sz w:val="18"/>
-              <w:szCs w:val="18"/>
-            </w:rPr>
-            <w:t>«CABINET</w:t>
-          </w:r>
-          <w:proofErr w:type="gramEnd"/>
-          <w:r>
-            <w:rPr>
-              <w:color w:val="808080" w:themeColor="background1" w:themeShade="80"/>
-              <w:sz w:val="18"/>
-              <w:szCs w:val="18"/>
-            </w:rPr>
-            <w:t>_MENTIONS»</w:t>
-          </w:r>
-        </w:p>
-      </w:tc>
-    </w:tr>
-  </w:tbl>
+<w:ftr xmlns:wpc="http://schemas.microsoft.com/office/word/2010/wordprocessingCanvas" xmlns:cx="http://schemas.microsoft.com/office/drawing/2014/chartex" xmlns:cx1="http://schemas.microsoft.com/office/drawing/2015/9/8/chartex" xmlns:cx2="http://schemas.microsoft.com/office/drawing/2015/10/21/chartex" xmlns:cx3="http://schemas.microsoft.com/office/drawing/2016/5/9/chartex" xmlns:cx4="http://schemas.microsoft.com/office/drawing/2016/5/10/chartex" xmlns:cx5="http://schemas.microsoft.com/office/drawing/2016/5/11/chartex" xmlns:cx6="http://schemas.microsoft.com/office/drawing/2016/5/12/chartex" xmlns:cx7="http://schemas.microsoft.com/office/drawing/2016/5/13/chartex" xmlns:cx8="http://schemas.microsoft.com/office/drawing/2016/5/14/chartex" xmlns:mc="http://schemas.openxmlformats.org/markup-compatibility/2006" xmlns:aink="http://schemas.microsoft.com/office/drawing/2016/ink" xmlns:am3d="http://schemas.microsoft.com/office/drawing/2017/model3d" xmlns:o="urn:schemas-microsoft-com:office:office" xmlns:oel="http://schemas.microsoft.com/office/2019/extlst" xmlns:r="http://schemas.openxmlformats.org/officeDocument/2006/relationships" xmlns:m="http://schemas.openxmlformats.org/officeDocument/2006/math" xmlns:v="urn:schemas-microsoft-com:vml" xmlns:wp14="http://schemas.microsoft.com/office/word/2010/wordprocessingDrawing" xmlns:wp="http://schemas.openxmlformats.org/drawingml/2006/wordprocessingDrawing" xmlns:w10="urn:schemas-microsoft-com:office:word" xmlns:w="http://schemas.openxmlformats.org/wordprocessingml/2006/main" xmlns:w14="http://schemas.microsoft.com/office/word/2010/wordml" xmlns:w15="http://schemas.microsoft.com/office/word/2012/wordml" xmlns:w16cex="http://schemas.microsoft.com/office/word/2018/wordml/cex" xmlns:w16cid="http://schemas.microsoft.com/office/word/2016/wordml/cid" xmlns:w16="http://schemas.microsoft.com/office/word/2018/wordml" xmlns:w16du="http://schemas.microsoft.com/office/word/2023/wordml/word16du" xmlns:w16sdtdh="http://schemas.microsoft.com/office/word/2020/wordml/sdtdatahash" xmlns:w16sdtfl="http://schemas.microsoft.com/office/word/2024/wordml/sdtformatlock" xmlns:w16se="http://schemas.microsoft.com/office/word/2015/wordml/symex" xmlns:wpg="http://schemas.microsoft.com/office/word/2010/wordprocessingGroup" xmlns:wpi="http://schemas.microsoft.com/office/word/2010/wordprocessingInk" xmlns:wne="http://schemas.microsoft.com/office/word/2006/wordml" xmlns:wps="http://schemas.microsoft.com/office/word/2010/wordprocessingShape" mc:Ignorable="w14 w15 w16se w16cid w16 w16cex w16sdtdh w16sdtfl w16du wp14">
+  <w:p>
+    <w:pPr>
+      <w:pStyle w:val="Pieddepage"/>
+      <w:spacing w:line="360" w:lineRule="auto"/>
+      <w:jc w:val="center"/>
+      <w:rPr>
+        <w:rFonts w:ascii="Times New Roman" w:hAnsi="Times New Roman" w:cs="Times New Roman"/>
+        <w:i/>
+        <w:iCs/>
+        <w:sz w:val="16"/>
+        <w:szCs w:val="16"/>
+      </w:rPr>
+    </w:pPr>
+    <w:r>
+      <w:rPr>
+        <w:rFonts w:ascii="Times New Roman" w:hAnsi="Times New Roman" w:cs="Times New Roman"/>
+        <w:i/>
+        <w:iCs/>
+        <w:sz w:val="16"/>
+        <w:szCs w:val="16"/>
+      </w:rPr>
+      <w:t>Société de Courtage en Assurance au capital social de 1 000 000 FCFA Agréé sous le N° 230/MEF/DGTCP/DA-DEMO du 04 Juillet 2017</w:t>
+    </w:r>
+  </w:p>
+  <w:p>
+    <w:pPr>
+      <w:pStyle w:val="Pieddepage"/>
+      <w:spacing w:line="360" w:lineRule="auto"/>
+      <w:jc w:val="center"/>
+      <w:rPr>
+        <w:rFonts w:ascii="Times New Roman" w:hAnsi="Times New Roman" w:cs="Times New Roman"/>
+        <w:i/>
+        <w:iCs/>
+        <w:sz w:val="16"/>
+        <w:szCs w:val="16"/>
+      </w:rPr>
+    </w:pPr>
+    <w:r>
+      <w:rPr>
+        <w:rFonts w:ascii="Times New Roman" w:hAnsi="Times New Roman" w:cs="Times New Roman"/>
+        <w:i/>
+        <w:iCs/>
+        <w:sz w:val="16"/>
+        <w:szCs w:val="16"/>
+      </w:rPr>
+      <w:t xml:space="preserve">RCCM N° CI-ABJ-2016-B-25253 - C.C N° 1649296 N - Tél. : 27 22 23 68 83 - </w:t>
+    </w:r>
+    <w:proofErr w:type="spellStart"/>
+    <w:r>
+      <w:rPr>
+        <w:rFonts w:ascii="Times New Roman" w:hAnsi="Times New Roman" w:cs="Times New Roman"/>
+        <w:i/>
+        <w:iCs/>
+        <w:sz w:val="16"/>
+        <w:szCs w:val="16"/>
+      </w:rPr>
+      <w:t>Cel</w:t>
+    </w:r>
+    <w:proofErr w:type="spellEnd"/>
+    <w:r>
+      <w:rPr>
+        <w:rFonts w:ascii="Times New Roman" w:hAnsi="Times New Roman" w:cs="Times New Roman"/>
+        <w:i/>
+        <w:iCs/>
+        <w:sz w:val="16"/>
+        <w:szCs w:val="16"/>
+      </w:rPr>
+      <w:t>. : 07 07 58 17 69 51 / 01 01 03 38 64 83</w:t>
+    </w:r>
+  </w:p>
+  <w:p>
+    <w:pPr>
+      <w:pStyle w:val="Pieddepage"/>
+      <w:spacing w:line="360" w:lineRule="auto"/>
+      <w:jc w:val="center"/>
+      <w:rPr>
+        <w:rFonts w:ascii="Times New Roman" w:hAnsi="Times New Roman" w:cs="Times New Roman"/>
+        <w:i/>
+        <w:iCs/>
+        <w:sz w:val="16"/>
+        <w:szCs w:val="16"/>
+      </w:rPr>
+    </w:pPr>
+    <w:r>
+      <w:rPr>
+        <w:rFonts w:ascii="Times New Roman" w:hAnsi="Times New Roman" w:cs="Times New Roman"/>
+        <w:i/>
+        <w:iCs/>
+        <w:sz w:val="16"/>
+        <w:szCs w:val="16"/>
+      </w:rPr>
+      <w:t>infos@abidjanaise-assurances.net - www.abidjanaise-assurances.ci</w:t>
+    </w:r>
+  </w:p>
   <w:p>
     <w:pPr>
       <w:pStyle w:val="Pieddepage"/>
@@ -1089,7 +1268,7 @@
 </file>
 
 <file path=word/footnotes.xml><?xml version="1.0" encoding="utf-8"?>
-<w:footnotes xmlns:wpc="http://schemas.microsoft.com/office/word/2010/wordprocessingCanvas" xmlns:cx="http://schemas.microsoft.com/office/drawing/2014/chartex" xmlns:cx1="http://schemas.microsoft.com/office/drawing/2015/9/8/chartex" xmlns:cx2="http://schemas.microsoft.com/office/drawing/2015/10/21/chartex" xmlns:cx3="http://schemas.microsoft.com/office/drawing/2016/5/9/chartex" xmlns:cx4="http://schemas.microsoft.com/office/drawing/2016/5/10/chartex" xmlns:cx5="http://schemas.microsoft.com/office/drawing/2016/5/11/chartex" xmlns:cx6="http://schemas.microsoft.com/office/drawing/2016/5/12/chartex" xmlns:cx7="http://schemas.microsoft.com/office/drawing/2016/5/13/chartex" xmlns:cx8="http://schemas.microsoft.com/office/drawing/2016/5/14/chartex" xmlns:mc="http://schemas.openxmlformats.org/markup-compatibility/2006" xmlns:aink="http://schemas.microsoft.com/office/drawing/2016/ink" xmlns:am3d="http://schemas.microsoft.com/office/drawing/2017/model3d" xmlns:o="urn:schemas-microsoft-com:office:office" xmlns:oel="http://schemas.microsoft.com/office/2019/extlst" xmlns:r="http://schemas.openxmlformats.org/officeDocument/2006/relationships" xmlns:m="http://schemas.openxmlformats.org/officeDocument/2006/math" xmlns:v="urn:schemas-microsoft-com:vml" xmlns:wp14="http://schemas.microsoft.com/office/word/2010/wordprocessingDrawing" xmlns:wp="http://schemas.openxmlformats.org/drawingml/2006/wordprocessingDrawing" xmlns:w10="urn:schemas-microsoft-com:office:word" xmlns:w="http://schemas.openxmlformats.org/wordprocessingml/2006/main" xmlns:w14="http://schemas.microsoft.com/office/word/2010/wordml" xmlns:w15="http://schemas.microsoft.com/office/word/2012/wordml" xmlns:w16cex="http://schemas.microsoft.com/office/word/2018/wordml/cex" xmlns:w16cid="http://schemas.microsoft.com/office/word/2016/wordml/cid" xmlns:w16="http://schemas.microsoft.com/office/word/2018/wordml" xmlns:w16sdtdh="http://schemas.microsoft.com/office/word/2020/wordml/sdtdatahash" xmlns:w16se="http://schemas.microsoft.com/office/word/2015/wordml/symex" xmlns:wpg="http://schemas.microsoft.com/office/word/2010/wordprocessingGroup" xmlns:wpi="http://schemas.microsoft.com/office/word/2010/wordprocessingInk" xmlns:wne="http://schemas.microsoft.com/office/word/2006/wordml" xmlns:wps="http://schemas.microsoft.com/office/word/2010/wordprocessingShape" mc:Ignorable="w14 w15 w16se w16cid w16 w16cex w16sdtdh wp14">
+<w:footnotes xmlns:wpc="http://schemas.microsoft.com/office/word/2010/wordprocessingCanvas" xmlns:cx="http://schemas.microsoft.com/office/drawing/2014/chartex" xmlns:cx1="http://schemas.microsoft.com/office/drawing/2015/9/8/chartex" xmlns:cx2="http://schemas.microsoft.com/office/drawing/2015/10/21/chartex" xmlns:cx3="http://schemas.microsoft.com/office/drawing/2016/5/9/chartex" xmlns:cx4="http://schemas.microsoft.com/office/drawing/2016/5/10/chartex" xmlns:cx5="http://schemas.microsoft.com/office/drawing/2016/5/11/chartex" xmlns:cx6="http://schemas.microsoft.com/office/drawing/2016/5/12/chartex" xmlns:cx7="http://schemas.microsoft.com/office/drawing/2016/5/13/chartex" xmlns:cx8="http://schemas.microsoft.com/office/drawing/2016/5/14/chartex" xmlns:mc="http://schemas.openxmlformats.org/markup-compatibility/2006" xmlns:aink="http://schemas.microsoft.com/office/drawing/2016/ink" xmlns:am3d="http://schemas.microsoft.com/office/drawing/2017/model3d" xmlns:o="urn:schemas-microsoft-com:office:office" xmlns:oel="http://schemas.microsoft.com/office/2019/extlst" xmlns:r="http://schemas.openxmlformats.org/officeDocument/2006/relationships" xmlns:m="http://schemas.openxmlformats.org/officeDocument/2006/math" xmlns:v="urn:schemas-microsoft-com:vml" xmlns:wp14="http://schemas.microsoft.com/office/word/2010/wordprocessingDrawing" xmlns:wp="http://schemas.openxmlformats.org/drawingml/2006/wordprocessingDrawing" xmlns:w10="urn:schemas-microsoft-com:office:word" xmlns:w="http://schemas.openxmlformats.org/wordprocessingml/2006/main" xmlns:w14="http://schemas.microsoft.com/office/word/2010/wordml" xmlns:w15="http://schemas.microsoft.com/office/word/2012/wordml" xmlns:w16cex="http://schemas.microsoft.com/office/word/2018/wordml/cex" xmlns:w16cid="http://schemas.microsoft.com/office/word/2016/wordml/cid" xmlns:w16="http://schemas.microsoft.com/office/word/2018/wordml" xmlns:w16du="http://schemas.microsoft.com/office/word/2023/wordml/word16du" xmlns:w16sdtdh="http://schemas.microsoft.com/office/word/2020/wordml/sdtdatahash" xmlns:w16sdtfl="http://schemas.microsoft.com/office/word/2024/wordml/sdtformatlock" xmlns:w16se="http://schemas.microsoft.com/office/word/2015/wordml/symex" xmlns:wpg="http://schemas.microsoft.com/office/word/2010/wordprocessingGroup" xmlns:wpi="http://schemas.microsoft.com/office/word/2010/wordprocessingInk" xmlns:wne="http://schemas.microsoft.com/office/word/2006/wordml" xmlns:wps="http://schemas.microsoft.com/office/word/2010/wordprocessingShape" mc:Ignorable="w14 w15 w16se w16cid w16 w16cex w16sdtdh w16sdtfl w16du wp14">
   <w:footnote w:type="separator" w:id="-1">
     <w:p>
       <w:pPr>
@@ -1114,12 +1293,10 @@
 </file>
 
 <file path=word/header1.xml><?xml version="1.0" encoding="utf-8"?>
-<w:hdr xmlns:wpc="http://schemas.microsoft.com/office/word/2010/wordprocessingCanvas" xmlns:cx="http://schemas.microsoft.com/office/drawing/2014/chartex" xmlns:cx1="http://schemas.microsoft.com/office/drawing/2015/9/8/chartex" xmlns:cx2="http://schemas.microsoft.com/office/drawing/2015/10/21/chartex" xmlns:cx3="http://schemas.microsoft.com/office/drawing/2016/5/9/chartex" xmlns:cx4="http://schemas.microsoft.com/office/drawing/2016/5/10/chartex" xmlns:cx5="http://schemas.microsoft.com/office/drawing/2016/5/11/chartex" xmlns:cx6="http://schemas.microsoft.com/office/drawing/2016/5/12/chartex" xmlns:cx7="http://schemas.microsoft.com/office/drawing/2016/5/13/chartex" xmlns:cx8="http://schemas.microsoft.com/office/drawing/2016/5/14/chartex" xmlns:mc="http://schemas.openxmlformats.org/markup-compatibility/2006" xmlns:aink="http://schemas.microsoft.com/office/drawing/2016/ink" xmlns:am3d="http://schemas.microsoft.com/office/drawing/2017/model3d" xmlns:o="urn:schemas-microsoft-com:office:office" xmlns:oel="http://schemas.microsoft.com/office/2019/extlst" xmlns:r="http://schemas.openxmlformats.org/officeDocument/2006/relationships" xmlns:m="http://schemas.openxmlformats.org/officeDocument/2006/math" xmlns:v="urn:schemas-microsoft-com:vml" xmlns:wp14="http://schemas.microsoft.com/office/word/2010/wordprocessingDrawing" xmlns:wp="http://schemas.openxmlformats.org/drawingml/2006/wordprocessingDrawing" xmlns:w10="urn:schemas-microsoft-com:office:word" xmlns:w="http://schemas.openxmlformats.org/wordprocessingml/2006/main" xmlns:w14="http://schemas.microsoft.com/office/word/2010/wordml" xmlns:w15="http://schemas.microsoft.com/office/word/2012/wordml" xmlns:w16cex="http://schemas.microsoft.com/office/word/2018/wordml/cex" xmlns:w16cid="http://schemas.microsoft.com/office/word/2016/wordml/cid" xmlns:w16="http://schemas.microsoft.com/office/word/2018/wordml" xmlns:w16sdtdh="http://schemas.microsoft.com/office/word/2020/wordml/sdtdatahash" xmlns:w16se="http://schemas.microsoft.com/office/word/2015/wordml/symex" xmlns:wpg="http://schemas.microsoft.com/office/word/2010/wordprocessingGroup" xmlns:wpi="http://schemas.microsoft.com/office/word/2010/wordprocessingInk" xmlns:wne="http://schemas.microsoft.com/office/word/2006/wordml" xmlns:wps="http://schemas.microsoft.com/office/word/2010/wordprocessingShape" mc:Ignorable="w14 w15 w16se w16cid w16 w16cex w16sdtdh wp14">
+<w:hdr xmlns:wpc="http://schemas.microsoft.com/office/word/2010/wordprocessingCanvas" xmlns:cx="http://schemas.microsoft.com/office/drawing/2014/chartex" xmlns:cx1="http://schemas.microsoft.com/office/drawing/2015/9/8/chartex" xmlns:cx2="http://schemas.microsoft.com/office/drawing/2015/10/21/chartex" xmlns:cx3="http://schemas.microsoft.com/office/drawing/2016/5/9/chartex" xmlns:cx4="http://schemas.microsoft.com/office/drawing/2016/5/10/chartex" xmlns:cx5="http://schemas.microsoft.com/office/drawing/2016/5/11/chartex" xmlns:cx6="http://schemas.microsoft.com/office/drawing/2016/5/12/chartex" xmlns:cx7="http://schemas.microsoft.com/office/drawing/2016/5/13/chartex" xmlns:cx8="http://schemas.microsoft.com/office/drawing/2016/5/14/chartex" xmlns:mc="http://schemas.openxmlformats.org/markup-compatibility/2006" xmlns:aink="http://schemas.microsoft.com/office/drawing/2016/ink" xmlns:am3d="http://schemas.microsoft.com/office/drawing/2017/model3d" xmlns:o="urn:schemas-microsoft-com:office:office" xmlns:oel="http://schemas.microsoft.com/office/2019/extlst" xmlns:r="http://schemas.openxmlformats.org/officeDocument/2006/relationships" xmlns:m="http://schemas.openxmlformats.org/officeDocument/2006/math" xmlns:v="urn:schemas-microsoft-com:vml" xmlns:wp14="http://schemas.microsoft.com/office/word/2010/wordprocessingDrawing" xmlns:wp="http://schemas.openxmlformats.org/drawingml/2006/wordprocessingDrawing" xmlns:w10="urn:schemas-microsoft-com:office:word" xmlns:w="http://schemas.openxmlformats.org/wordprocessingml/2006/main" xmlns:w14="http://schemas.microsoft.com/office/word/2010/wordml" xmlns:w15="http://schemas.microsoft.com/office/word/2012/wordml" xmlns:w16cex="http://schemas.microsoft.com/office/word/2018/wordml/cex" xmlns:w16cid="http://schemas.microsoft.com/office/word/2016/wordml/cid" xmlns:w16="http://schemas.microsoft.com/office/word/2018/wordml" xmlns:w16du="http://schemas.microsoft.com/office/word/2023/wordml/word16du" xmlns:w16sdtdh="http://schemas.microsoft.com/office/word/2020/wordml/sdtdatahash" xmlns:w16sdtfl="http://schemas.microsoft.com/office/word/2024/wordml/sdtformatlock" xmlns:w16se="http://schemas.microsoft.com/office/word/2015/wordml/symex" xmlns:wpg="http://schemas.microsoft.com/office/word/2010/wordprocessingGroup" xmlns:wpi="http://schemas.microsoft.com/office/word/2010/wordprocessingInk" xmlns:wne="http://schemas.microsoft.com/office/word/2006/wordml" xmlns:wps="http://schemas.microsoft.com/office/word/2010/wordprocessingShape" mc:Ignorable="w14 w15 w16se w16cid w16 w16cex w16sdtdh w16sdtfl w16du wp14">
   <w:p>
     <w:pPr>
-      <w:rPr>
-        <w:rFonts w:ascii="Avenir" w:hAnsi="Avenir"/>
-      </w:rPr>
+      <w:pStyle w:val="En-tte"/>
     </w:pPr>
     <w:r>
       <w:rPr>
@@ -1219,7 +1396,7 @@
               <v:stroke joinstyle="miter"/>
               <v:path gradientshapeok="t" o:connecttype="rect"/>
             </v:shapetype>
-            <v:shape id="Zone de texte 1" o:spid="_x0000_s1026" type="#_x0000_t202" style="position:absolute;margin-left:279pt;margin-top:-15.05pt;width:201pt;height:27pt;z-index:251659264;visibility:visible;mso-wrap-style:square;mso-height-percent:0;mso-wrap-distance-left:9pt;mso-wrap-distance-top:0;mso-wrap-distance-right:9pt;mso-wrap-distance-bottom:0;mso-position-horizontal:absolute;mso-position-horizontal-relative:margin;mso-position-vertical:absolute;mso-position-vertical-relative:text;mso-height-percent:0;mso-height-relative:margin;v-text-anchor:top" o:gfxdata="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" fillcolor="white [3201]" strokeweight=".5pt">
+            <v:shape id="Zone de texte 1" o:spid="_x0000_s1026" type="#_x0000_t202" style="position:absolute;margin-left:279pt;margin-top:-15.05pt;width:201pt;height:27pt;z-index:251659264;visibility:visible;mso-wrap-style:square;mso-height-percent:0;mso-wrap-distance-left:9pt;mso-wrap-distance-top:0;mso-wrap-distance-right:9pt;mso-wrap-distance-bottom:0;mso-position-horizontal:absolute;mso-position-horizontal-relative:margin;mso-position-vertical:absolute;mso-position-vertical-relative:text;mso-height-percent:0;mso-height-relative:margin;v-text-anchor:top" o:gfxdata="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" fillcolor="white [3201]" strokeweight=".5pt">
               <v:textbox>
                 <w:txbxContent>
                   <w:p>
@@ -1248,10 +1425,49 @@
     </w:r>
     <w:r>
       <w:rPr>
-        <w:rFonts w:ascii="Avenir" w:hAnsi="Avenir"/>
-        <w:lang w:val="en-US"/>
+        <w:noProof/>
       </w:rPr>
-      <w:t>«LOGO_SOC»</w:t>
+      <w:drawing>
+        <wp:inline distT="0" distB="0" distL="0" distR="0" wp14:anchorId="31B6D394" wp14:editId="509D4AA3">
+          <wp:extent cx="1533525" cy="734060"/>
+          <wp:effectExtent l="0" t="0" r="9525" b="8890"/>
+          <wp:docPr id="667687861" name="Image 3"/>
+          <wp:cNvGraphicFramePr>
+            <a:graphicFrameLocks xmlns:a="http://schemas.openxmlformats.org/drawingml/2006/main" noChangeAspect="1"/>
+          </wp:cNvGraphicFramePr>
+          <a:graphic xmlns:a="http://schemas.openxmlformats.org/drawingml/2006/main">
+            <a:graphicData uri="http://schemas.openxmlformats.org/drawingml/2006/picture">
+              <pic:pic xmlns:pic="http://schemas.openxmlformats.org/drawingml/2006/picture">
+                <pic:nvPicPr>
+                  <pic:cNvPr id="667687861" name="Image 667687861"/>
+                  <pic:cNvPicPr/>
+                </pic:nvPicPr>
+                <pic:blipFill>
+                  <a:blip r:embed="rId1">
+                    <a:extLst>
+                      <a:ext uri="{28A0092B-C50C-407E-A947-70E740481C1C}">
+                        <a14:useLocalDpi xmlns:a14="http://schemas.microsoft.com/office/drawing/2010/main" val="0"/>
+                      </a:ext>
+                    </a:extLst>
+                  </a:blip>
+                  <a:stretch>
+                    <a:fillRect/>
+                  </a:stretch>
+                </pic:blipFill>
+                <pic:spPr>
+                  <a:xfrm>
+                    <a:off x="0" y="0"/>
+                    <a:ext cx="1581597" cy="757071"/>
+                  </a:xfrm>
+                  <a:prstGeom prst="rect">
+                    <a:avLst/>
+                  </a:prstGeom>
+                </pic:spPr>
+              </pic:pic>
+            </a:graphicData>
+          </a:graphic>
+        </wp:inline>
+      </w:drawing>
     </w:r>
   </w:p>
   <w:p>
@@ -1263,7 +1479,7 @@
 </file>
 
 <file path=word/styles.xml><?xml version="1.0" encoding="utf-8"?>
-<w:styles xmlns:mc="http://schemas.openxmlformats.org/markup-compatibility/2006" xmlns:r="http://schemas.openxmlformats.org/officeDocument/2006/relationships" xmlns:w="http://schemas.openxmlformats.org/wordprocessingml/2006/main" xmlns:w14="http://schemas.microsoft.com/office/word/2010/wordml" xmlns:w15="http://schemas.microsoft.com/office/word/2012/wordml" xmlns:w16cex="http://schemas.microsoft.com/office/word/2018/wordml/cex" xmlns:w16cid="http://schemas.microsoft.com/office/word/2016/wordml/cid" xmlns:w16="http://schemas.microsoft.com/office/word/2018/wordml" xmlns:w16sdtdh="http://schemas.microsoft.com/office/word/2020/wordml/sdtdatahash" xmlns:w16se="http://schemas.microsoft.com/office/word/2015/wordml/symex" mc:Ignorable="w14 w15 w16se w16cid w16 w16cex w16sdtdh">
+<w:styles xmlns:mc="http://schemas.openxmlformats.org/markup-compatibility/2006" xmlns:r="http://schemas.openxmlformats.org/officeDocument/2006/relationships" xmlns:w="http://schemas.openxmlformats.org/wordprocessingml/2006/main" xmlns:w14="http://schemas.microsoft.com/office/word/2010/wordml" xmlns:w15="http://schemas.microsoft.com/office/word/2012/wordml" xmlns:w16cex="http://schemas.microsoft.com/office/word/2018/wordml/cex" xmlns:w16cid="http://schemas.microsoft.com/office/word/2016/wordml/cid" xmlns:w16="http://schemas.microsoft.com/office/word/2018/wordml" xmlns:w16du="http://schemas.microsoft.com/office/word/2023/wordml/word16du" xmlns:w16sdtdh="http://schemas.microsoft.com/office/word/2020/wordml/sdtdatahash" xmlns:w16sdtfl="http://schemas.microsoft.com/office/word/2024/wordml/sdtformatlock" xmlns:w16se="http://schemas.microsoft.com/office/word/2015/wordml/symex" mc:Ignorable="w14 w15 w16se w16cid w16 w16cex w16sdtdh w16sdtfl w16du">
   <w:docDefaults>
     <w:rPrDefault>
       <w:rPr>

</xml_diff>